<commit_message>
added animation capability to  application via local hosting
</commit_message>
<xml_diff>
--- a/5 Colour Theorem Kempe.docx
+++ b/5 Colour Theorem Kempe.docx
@@ -82,17 +82,439 @@
     <w:p>
       <w:pPr>
         <w:rPr>
-          <w:sz w:val="28"/>
-          <w:szCs w:val="28"/>
-          <w:lang w:val="en-GB"/>
-        </w:rPr>
-      </w:pPr>
-      <w:r>
-        <w:rPr>
-          <w:sz w:val="28"/>
-          <w:szCs w:val="28"/>
-          <w:lang w:val="en-GB"/>
-        </w:rPr>
+          <w:rFonts w:ascii="Bookman Old Style" w:hAnsi="Bookman Old Style"/>
+          <w:lang w:val="en-GB"/>
+        </w:rPr>
+      </w:pPr>
+      <w:r>
+        <w:rPr>
+          <w:rFonts w:ascii="Bookman Old Style" w:hAnsi="Bookman Old Style"/>
+          <w:lang w:val="en-GB"/>
+        </w:rPr>
+        <w:t>March 12</w:t>
+      </w:r>
+      <w:proofErr w:type="gramStart"/>
+      <w:r>
+        <w:rPr>
+          <w:rFonts w:ascii="Bookman Old Style" w:hAnsi="Bookman Old Style"/>
+          <w:lang w:val="en-GB"/>
+        </w:rPr>
+        <w:t xml:space="preserve"> 2026</w:t>
+      </w:r>
+      <w:proofErr w:type="gramEnd"/>
+      <w:r>
+        <w:rPr>
+          <w:rFonts w:ascii="Bookman Old Style" w:hAnsi="Bookman Old Style"/>
+          <w:lang w:val="en-GB"/>
+        </w:rPr>
+        <w:t xml:space="preserve"> (~7-10 mins planned):</w:t>
+      </w:r>
+    </w:p>
+    <w:p>
+      <w:pPr>
+        <w:pStyle w:val="ListParagraph"/>
+        <w:numPr>
+          <w:ilvl w:val="0"/>
+          <w:numId w:val="6"/>
+        </w:numPr>
+        <w:rPr>
+          <w:rFonts w:ascii="Bookman Old Style" w:hAnsi="Bookman Old Style"/>
+          <w:lang w:val="en-GB"/>
+        </w:rPr>
+      </w:pPr>
+      <w:r>
+        <w:rPr>
+          <w:rFonts w:ascii="Bookman Old Style" w:hAnsi="Bookman Old Style"/>
+          <w:lang w:val="en-GB"/>
+        </w:rPr>
+        <w:t>Overview, proof, and method.</w:t>
+      </w:r>
+    </w:p>
+    <w:p>
+      <w:pPr>
+        <w:pStyle w:val="ListParagraph"/>
+        <w:numPr>
+          <w:ilvl w:val="1"/>
+          <w:numId w:val="6"/>
+        </w:numPr>
+        <w:rPr>
+          <w:rFonts w:ascii="Bookman Old Style" w:hAnsi="Bookman Old Style"/>
+          <w:lang w:val="en-GB"/>
+        </w:rPr>
+      </w:pPr>
+      <w:r>
+        <w:rPr>
+          <w:rFonts w:ascii="Bookman Old Style" w:hAnsi="Bookman Old Style"/>
+          <w:lang w:val="en-GB"/>
+        </w:rPr>
+        <w:t>TC: O(n^2)</w:t>
+      </w:r>
+    </w:p>
+    <w:p>
+      <w:pPr>
+        <w:pStyle w:val="ListParagraph"/>
+        <w:numPr>
+          <w:ilvl w:val="0"/>
+          <w:numId w:val="6"/>
+        </w:numPr>
+        <w:rPr>
+          <w:rFonts w:ascii="Bookman Old Style" w:hAnsi="Bookman Old Style"/>
+          <w:lang w:val="en-GB"/>
+        </w:rPr>
+      </w:pPr>
+      <w:r>
+        <w:rPr>
+          <w:rFonts w:ascii="Bookman Old Style" w:hAnsi="Bookman Old Style"/>
+          <w:lang w:val="en-GB"/>
+        </w:rPr>
+        <w:t>Graph viewer + examples</w:t>
+      </w:r>
+    </w:p>
+    <w:p>
+      <w:pPr>
+        <w:pStyle w:val="ListParagraph"/>
+        <w:numPr>
+          <w:ilvl w:val="0"/>
+          <w:numId w:val="6"/>
+        </w:numPr>
+        <w:rPr>
+          <w:rFonts w:ascii="Bookman Old Style" w:hAnsi="Bookman Old Style"/>
+          <w:lang w:val="en-GB"/>
+        </w:rPr>
+      </w:pPr>
+      <w:r>
+        <w:rPr>
+          <w:rFonts w:ascii="Bookman Old Style" w:hAnsi="Bookman Old Style"/>
+          <w:lang w:val="en-GB"/>
+        </w:rPr>
+        <w:t xml:space="preserve">Proving </w:t>
+      </w:r>
+      <w:proofErr w:type="gramStart"/>
+      <w:r>
+        <w:rPr>
+          <w:rFonts w:ascii="Bookman Old Style" w:hAnsi="Bookman Old Style"/>
+          <w:lang w:val="en-GB"/>
+        </w:rPr>
+        <w:t>HC(</w:t>
+      </w:r>
+      <w:proofErr w:type="gramEnd"/>
+      <w:r>
+        <w:rPr>
+          <w:rFonts w:ascii="Bookman Old Style" w:hAnsi="Bookman Old Style"/>
+          <w:lang w:val="en-GB"/>
+        </w:rPr>
+        <w:t>6) with Kempe-based method</w:t>
+      </w:r>
+    </w:p>
+    <w:p>
+      <w:pPr>
+        <w:pStyle w:val="ListParagraph"/>
+        <w:numPr>
+          <w:ilvl w:val="1"/>
+          <w:numId w:val="6"/>
+        </w:numPr>
+        <w:rPr>
+          <w:rFonts w:ascii="Bookman Old Style" w:hAnsi="Bookman Old Style"/>
+          <w:lang w:val="en-GB"/>
+        </w:rPr>
+      </w:pPr>
+      <w:r>
+        <w:rPr>
+          <w:rFonts w:ascii="Bookman Old Style" w:hAnsi="Bookman Old Style"/>
+          <w:lang w:val="en-GB"/>
+        </w:rPr>
+        <w:t>“</w:t>
+      </w:r>
+      <w:proofErr w:type="gramStart"/>
+      <w:r>
+        <w:rPr>
+          <w:rFonts w:ascii="Bookman Old Style" w:hAnsi="Bookman Old Style"/>
+          <w:lang w:val="en-GB"/>
+        </w:rPr>
+        <w:t>reduces</w:t>
+      </w:r>
+      <w:proofErr w:type="gramEnd"/>
+      <w:r>
+        <w:rPr>
+          <w:rFonts w:ascii="Bookman Old Style" w:hAnsi="Bookman Old Style"/>
+          <w:lang w:val="en-GB"/>
+        </w:rPr>
+        <w:t xml:space="preserve"> to 4CT [Robertson, Seymour, Thomas]”</w:t>
+      </w:r>
+    </w:p>
+    <w:p>
+      <w:pPr>
+        <w:pStyle w:val="ListParagraph"/>
+        <w:numPr>
+          <w:ilvl w:val="1"/>
+          <w:numId w:val="6"/>
+        </w:numPr>
+        <w:rPr>
+          <w:rFonts w:ascii="Bookman Old Style" w:hAnsi="Bookman Old Style"/>
+          <w:lang w:val="en-GB"/>
+        </w:rPr>
+      </w:pPr>
+      <w:r>
+        <w:rPr>
+          <w:rFonts w:ascii="Bookman Old Style" w:hAnsi="Bookman Old Style"/>
+          <w:lang w:val="en-GB"/>
+        </w:rPr>
+        <w:t>Interesting things and questions:</w:t>
+      </w:r>
+    </w:p>
+    <w:p>
+      <w:pPr>
+        <w:pStyle w:val="ListParagraph"/>
+        <w:numPr>
+          <w:ilvl w:val="2"/>
+          <w:numId w:val="6"/>
+        </w:numPr>
+        <w:rPr>
+          <w:rFonts w:ascii="Bookman Old Style" w:hAnsi="Bookman Old Style"/>
+          <w:lang w:val="en-GB"/>
+        </w:rPr>
+      </w:pPr>
+      <w:r>
+        <w:rPr>
+          <w:rFonts w:ascii="Bookman Old Style" w:hAnsi="Bookman Old Style"/>
+          <w:lang w:val="en-GB"/>
+        </w:rPr>
+        <w:t>HC (5) “is equivalent to 4CT”</w:t>
+      </w:r>
+    </w:p>
+    <w:p>
+      <w:pPr>
+        <w:pStyle w:val="ListParagraph"/>
+        <w:numPr>
+          <w:ilvl w:val="3"/>
+          <w:numId w:val="6"/>
+        </w:numPr>
+        <w:rPr>
+          <w:rFonts w:ascii="Bookman Old Style" w:hAnsi="Bookman Old Style"/>
+          <w:lang w:val="en-GB"/>
+        </w:rPr>
+      </w:pPr>
+      <w:r>
+        <w:rPr>
+          <w:rFonts w:ascii="Bookman Old Style" w:hAnsi="Bookman Old Style"/>
+          <w:lang w:val="en-GB"/>
+        </w:rPr>
+        <w:t>Where is K3,3?</w:t>
+      </w:r>
+    </w:p>
+    <w:p>
+      <w:pPr>
+        <w:pStyle w:val="ListParagraph"/>
+        <w:numPr>
+          <w:ilvl w:val="2"/>
+          <w:numId w:val="6"/>
+        </w:numPr>
+        <w:rPr>
+          <w:rFonts w:ascii="Bookman Old Style" w:hAnsi="Bookman Old Style"/>
+          <w:lang w:val="en-GB"/>
+        </w:rPr>
+      </w:pPr>
+      <w:r>
+        <w:rPr>
+          <w:rFonts w:ascii="Bookman Old Style" w:hAnsi="Bookman Old Style"/>
+          <w:lang w:val="en-GB"/>
+        </w:rPr>
+        <w:t>If prove K5 and planar graph network is 5 colourable, then HC (6) true?</w:t>
+      </w:r>
+    </w:p>
+    <w:p>
+      <w:pPr>
+        <w:pStyle w:val="ListParagraph"/>
+        <w:numPr>
+          <w:ilvl w:val="2"/>
+          <w:numId w:val="6"/>
+        </w:numPr>
+        <w:rPr>
+          <w:lang w:val="en-GB"/>
+        </w:rPr>
+      </w:pPr>
+      <w:r>
+        <w:rPr>
+          <w:lang w:val="en-GB"/>
+        </w:rPr>
+        <w:t>Every finite, maximally K5 graph is 4-degenerate:</w:t>
+      </w:r>
+    </w:p>
+    <w:p>
+      <w:pPr>
+        <w:pStyle w:val="ListParagraph"/>
+        <w:numPr>
+          <w:ilvl w:val="2"/>
+          <w:numId w:val="6"/>
+        </w:numPr>
+        <w:rPr>
+          <w:rFonts w:ascii="Bookman Old Style" w:hAnsi="Bookman Old Style"/>
+          <w:lang w:val="en-GB"/>
+        </w:rPr>
+      </w:pPr>
+      <w:r>
+        <w:rPr>
+          <w:lang w:val="en-GB"/>
+        </w:rPr>
+        <w:t>Any maximally K5 graph G is 5 colourable</w:t>
+      </w:r>
+    </w:p>
+    <w:p>
+      <w:pPr>
+        <w:pStyle w:val="ListParagraph"/>
+        <w:numPr>
+          <w:ilvl w:val="1"/>
+          <w:numId w:val="6"/>
+        </w:numPr>
+        <w:rPr>
+          <w:rFonts w:ascii="Bookman Old Style" w:hAnsi="Bookman Old Style"/>
+          <w:lang w:val="en-GB"/>
+        </w:rPr>
+      </w:pPr>
+      <w:r>
+        <w:rPr>
+          <w:rFonts w:ascii="Bookman Old Style" w:hAnsi="Bookman Old Style"/>
+          <w:lang w:val="en-GB"/>
+        </w:rPr>
+        <w:t>One extra case:</w:t>
+      </w:r>
+    </w:p>
+    <w:p>
+      <w:pPr>
+        <w:pStyle w:val="ListParagraph"/>
+        <w:numPr>
+          <w:ilvl w:val="3"/>
+          <w:numId w:val="6"/>
+        </w:numPr>
+        <w:rPr>
+          <w:rFonts w:ascii="Bookman Old Style" w:hAnsi="Bookman Old Style"/>
+          <w:lang w:val="en-GB"/>
+        </w:rPr>
+      </w:pPr>
+      <w:r>
+        <w:rPr>
+          <w:noProof/>
+          <w:lang w:val="en-GB"/>
+        </w:rPr>
+        <w:drawing>
+          <wp:inline distT="0" distB="0" distL="0" distR="0" wp14:anchorId="089AA980" wp14:editId="30655883">
+            <wp:extent cx="1581371" cy="1467055"/>
+            <wp:effectExtent l="0" t="0" r="0" b="0"/>
+            <wp:docPr id="1913212165" name="Picture 1"/>
+            <wp:cNvGraphicFramePr>
+              <a:graphicFrameLocks xmlns:a="http://schemas.openxmlformats.org/drawingml/2006/main" noChangeAspect="1"/>
+            </wp:cNvGraphicFramePr>
+            <a:graphic xmlns:a="http://schemas.openxmlformats.org/drawingml/2006/main">
+              <a:graphicData uri="http://schemas.openxmlformats.org/drawingml/2006/picture">
+                <pic:pic xmlns:pic="http://schemas.openxmlformats.org/drawingml/2006/picture">
+                  <pic:nvPicPr>
+                    <pic:cNvPr id="1913212165" name=""/>
+                    <pic:cNvPicPr/>
+                  </pic:nvPicPr>
+                  <pic:blipFill>
+                    <a:blip r:embed="rId5"/>
+                    <a:stretch>
+                      <a:fillRect/>
+                    </a:stretch>
+                  </pic:blipFill>
+                  <pic:spPr>
+                    <a:xfrm>
+                      <a:off x="0" y="0"/>
+                      <a:ext cx="1581371" cy="1467055"/>
+                    </a:xfrm>
+                    <a:prstGeom prst="rect">
+                      <a:avLst/>
+                    </a:prstGeom>
+                  </pic:spPr>
+                </pic:pic>
+              </a:graphicData>
+            </a:graphic>
+          </wp:inline>
+        </w:drawing>
+      </w:r>
+    </w:p>
+    <w:p>
+      <w:pPr>
+        <w:pStyle w:val="ListParagraph"/>
+        <w:numPr>
+          <w:ilvl w:val="1"/>
+          <w:numId w:val="6"/>
+        </w:numPr>
+        <w:rPr>
+          <w:rFonts w:ascii="Bookman Old Style" w:hAnsi="Bookman Old Style"/>
+          <w:lang w:val="en-GB"/>
+        </w:rPr>
+      </w:pPr>
+      <w:r>
+        <w:rPr>
+          <w:rFonts w:ascii="Bookman Old Style" w:hAnsi="Bookman Old Style"/>
+          <w:lang w:val="en-GB"/>
+        </w:rPr>
+        <w:t>Apex graph.</w:t>
+      </w:r>
+    </w:p>
+    <w:p>
+      <w:pPr>
+        <w:rPr>
+          <w:rFonts w:ascii="Bookman Old Style" w:hAnsi="Bookman Old Style"/>
+          <w:lang w:val="en-GB"/>
+        </w:rPr>
+      </w:pPr>
+    </w:p>
+    <w:p>
+      <w:pPr>
+        <w:rPr>
+          <w:rFonts w:ascii="Bookman Old Style" w:hAnsi="Bookman Old Style"/>
+          <w:lang w:val="en-GB"/>
+        </w:rPr>
+      </w:pPr>
+    </w:p>
+    <w:p>
+      <w:pPr>
+        <w:rPr>
+          <w:rFonts w:ascii="Bookman Old Style" w:hAnsi="Bookman Old Style"/>
+          <w:lang w:val="en-GB"/>
+        </w:rPr>
+      </w:pPr>
+    </w:p>
+    <w:p>
+      <w:pPr>
+        <w:rPr>
+          <w:rFonts w:ascii="Bookman Old Style" w:hAnsi="Bookman Old Style"/>
+          <w:lang w:val="en-GB"/>
+        </w:rPr>
+      </w:pPr>
+    </w:p>
+    <w:p>
+      <w:pPr>
+        <w:rPr>
+          <w:rFonts w:ascii="Bookman Old Style" w:hAnsi="Bookman Old Style"/>
+          <w:lang w:val="en-GB"/>
+        </w:rPr>
+      </w:pPr>
+    </w:p>
+    <w:p>
+      <w:pPr>
+        <w:rPr>
+          <w:lang w:val="en-GB"/>
+        </w:rPr>
+      </w:pPr>
+    </w:p>
+    <w:p>
+      <w:pPr>
+        <w:rPr>
+          <w:sz w:val="28"/>
+          <w:szCs w:val="28"/>
+          <w:lang w:val="en-GB"/>
+        </w:rPr>
+      </w:pPr>
+      <w:r>
+        <w:rPr>
+          <w:sz w:val="28"/>
+          <w:szCs w:val="28"/>
+          <w:lang w:val="en-GB"/>
+        </w:rPr>
+        <w:lastRenderedPageBreak/>
         <w:t xml:space="preserve">A </w:t>
       </w:r>
       <w:r>
@@ -616,7 +1038,6 @@
           <w:szCs w:val="28"/>
           <w:lang w:val="en-GB"/>
         </w:rPr>
-        <w:lastRenderedPageBreak/>
         <w:t>So, P(k+1) is true.</w:t>
       </w:r>
     </w:p>
@@ -670,6 +1091,7 @@
           <w:szCs w:val="28"/>
           <w:lang w:val="en-GB"/>
         </w:rPr>
+        <w:lastRenderedPageBreak/>
         <w:t xml:space="preserve">Our </w:t>
       </w:r>
       <w:r>
@@ -739,7 +1161,7 @@
                 <wp:cNvGraphicFramePr/>
                 <a:graphic xmlns:a="http://schemas.openxmlformats.org/drawingml/2006/main">
                   <a:graphicData uri="http://schemas.microsoft.com/office/word/2010/wordprocessingInk">
-                    <w14:contentPart bwMode="auto" r:id="rId5">
+                    <w14:contentPart bwMode="auto" r:id="rId6">
                       <w14:nvContentPartPr>
                         <w14:cNvContentPartPr/>
                       </w14:nvContentPartPr>
@@ -775,7 +1197,7 @@
                 <o:lock v:ext="edit" aspectratio="t"/>
               </v:shapetype>
               <v:shape id="Ink 7" o:spid="_x0000_s1026" type="#_x0000_t75" style="position:absolute;margin-left:162.7pt;margin-top:124.15pt;width:164.85pt;height:142.05pt;z-index:251665408;visibility:visible;mso-wrap-style:square;mso-wrap-distance-left:9pt;mso-wrap-distance-top:0;mso-wrap-distance-right:9pt;mso-wrap-distance-bottom:0;mso-position-horizontal:absolute;mso-position-horizontal-relative:text;mso-position-vertical:absolute;mso-position-vertical-relative:text" o:gfxdata="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">
-                <v:imagedata r:id="rId6" o:title=""/>
+                <v:imagedata r:id="rId7" o:title=""/>
               </v:shape>
             </w:pict>
           </mc:Fallback>
@@ -785,6 +1207,7 @@
         <w:rPr>
           <w:b/>
           <w:bCs/>
+          <w:noProof/>
           <w:sz w:val="36"/>
           <w:szCs w:val="36"/>
           <w:u w:val="single"/>
@@ -806,7 +1229,7 @@
                     <pic:cNvPicPr/>
                   </pic:nvPicPr>
                   <pic:blipFill>
-                    <a:blip r:embed="rId7"/>
+                    <a:blip r:embed="rId8"/>
                     <a:stretch>
                       <a:fillRect/>
                     </a:stretch>
@@ -920,7 +1343,6 @@
           <w:szCs w:val="28"/>
           <w:lang w:val="en-GB"/>
         </w:rPr>
-        <w:lastRenderedPageBreak/>
         <w:t xml:space="preserve">5 </w:t>
       </w:r>
       <w:r>
@@ -1048,6 +1470,7 @@
           <w:szCs w:val="28"/>
           <w:lang w:val="en-GB"/>
         </w:rPr>
+        <w:lastRenderedPageBreak/>
         <w:t xml:space="preserve">The </w:t>
       </w:r>
       <w:r>
@@ -1261,6 +1684,7 @@
       </w:pPr>
       <w:r>
         <w:rPr>
+          <w:noProof/>
           <w:sz w:val="28"/>
           <w:szCs w:val="28"/>
           <w:lang w:val="en-GB"/>
@@ -1281,7 +1705,7 @@
                     <pic:cNvPicPr/>
                   </pic:nvPicPr>
                   <pic:blipFill>
-                    <a:blip r:embed="rId8"/>
+                    <a:blip r:embed="rId9"/>
                     <a:stretch>
                       <a:fillRect/>
                     </a:stretch>
@@ -1303,6 +1727,7 @@
       </w:r>
       <w:r>
         <w:rPr>
+          <w:noProof/>
           <w:sz w:val="28"/>
           <w:szCs w:val="28"/>
           <w:lang w:val="en-GB"/>
@@ -1323,7 +1748,7 @@
                     <pic:cNvPicPr/>
                   </pic:nvPicPr>
                   <pic:blipFill>
-                    <a:blip r:embed="rId9"/>
+                    <a:blip r:embed="rId10"/>
                     <a:stretch>
                       <a:fillRect/>
                     </a:stretch>
@@ -1520,32 +1945,33 @@
         <w:rPr>
           <w:noProof/>
         </w:rPr>
+        <w:t>India</w:t>
+      </w:r>
+      <w:r>
+        <w:rPr>
+          <w:noProof/>
+        </w:rPr>
+        <w:t xml:space="preserve"> (unconnected graph)</w:t>
+      </w:r>
+      <w:r>
+        <w:rPr>
+          <w:noProof/>
+        </w:rPr>
+        <w:t>:</w:t>
+      </w:r>
+    </w:p>
+    <w:p>
+      <w:pPr>
+        <w:rPr>
+          <w:noProof/>
+        </w:rPr>
+      </w:pPr>
+      <w:r>
+        <w:rPr>
+          <w:noProof/>
+          <w:lang w:val="en-GB"/>
+        </w:rPr>
         <w:lastRenderedPageBreak/>
-        <w:t>India</w:t>
-      </w:r>
-      <w:r>
-        <w:rPr>
-          <w:noProof/>
-        </w:rPr>
-        <w:t xml:space="preserve"> (unconnected graph)</w:t>
-      </w:r>
-      <w:r>
-        <w:rPr>
-          <w:noProof/>
-        </w:rPr>
-        <w:t>:</w:t>
-      </w:r>
-    </w:p>
-    <w:p>
-      <w:pPr>
-        <w:rPr>
-          <w:noProof/>
-        </w:rPr>
-      </w:pPr>
-      <w:r>
-        <w:rPr>
-          <w:lang w:val="en-GB"/>
-        </w:rPr>
         <w:drawing>
           <wp:inline distT="0" distB="0" distL="0" distR="0" wp14:anchorId="2C9EE22B" wp14:editId="66574AB5">
             <wp:extent cx="2850938" cy="2892972"/>
@@ -1562,7 +1988,7 @@
                     <pic:cNvPicPr/>
                   </pic:nvPicPr>
                   <pic:blipFill>
-                    <a:blip r:embed="rId10"/>
+                    <a:blip r:embed="rId11"/>
                     <a:stretch>
                       <a:fillRect/>
                     </a:stretch>
@@ -1590,6 +2016,7 @@
       </w:r>
       <w:r>
         <w:rPr>
+          <w:noProof/>
           <w:lang w:val="en-GB"/>
         </w:rPr>
         <w:drawing>
@@ -1608,7 +2035,7 @@
                     <pic:cNvPicPr/>
                   </pic:nvPicPr>
                   <pic:blipFill>
-                    <a:blip r:embed="rId11"/>
+                    <a:blip r:embed="rId12"/>
                     <a:stretch>
                       <a:fillRect/>
                     </a:stretch>
@@ -1662,6 +2089,7 @@
       </w:pPr>
       <w:r>
         <w:rPr>
+          <w:noProof/>
           <w:lang w:val="en-GB"/>
         </w:rPr>
         <w:drawing>
@@ -1680,7 +2108,7 @@
                     <pic:cNvPicPr/>
                   </pic:nvPicPr>
                   <pic:blipFill>
-                    <a:blip r:embed="rId12"/>
+                    <a:blip r:embed="rId13"/>
                     <a:stretch>
                       <a:fillRect/>
                     </a:stretch>
@@ -1708,6 +2136,7 @@
       </w:r>
       <w:r>
         <w:rPr>
+          <w:noProof/>
           <w:lang w:val="en-GB"/>
         </w:rPr>
         <w:drawing>
@@ -1726,7 +2155,7 @@
                     <pic:cNvPicPr/>
                   </pic:nvPicPr>
                   <pic:blipFill>
-                    <a:blip r:embed="rId13"/>
+                    <a:blip r:embed="rId14"/>
                     <a:stretch>
                       <a:fillRect/>
                     </a:stretch>
@@ -1800,7 +2229,7 @@
                     <pic:cNvPicPr/>
                   </pic:nvPicPr>
                   <pic:blipFill>
-                    <a:blip r:embed="rId14"/>
+                    <a:blip r:embed="rId15"/>
                     <a:stretch>
                       <a:fillRect/>
                     </a:stretch>
@@ -1828,6 +2257,7 @@
       </w:r>
       <w:r>
         <w:rPr>
+          <w:noProof/>
           <w:sz w:val="28"/>
           <w:szCs w:val="28"/>
           <w:lang w:val="en-GB"/>
@@ -1848,7 +2278,7 @@
                     <pic:cNvPicPr/>
                   </pic:nvPicPr>
                   <pic:blipFill>
-                    <a:blip r:embed="rId15"/>
+                    <a:blip r:embed="rId16"/>
                     <a:stretch>
                       <a:fillRect/>
                     </a:stretch>
@@ -1910,7 +2340,7 @@
                     <pic:cNvPicPr/>
                   </pic:nvPicPr>
                   <pic:blipFill>
-                    <a:blip r:embed="rId16"/>
+                    <a:blip r:embed="rId17"/>
                     <a:stretch>
                       <a:fillRect/>
                     </a:stretch>
@@ -1956,7 +2386,7 @@
                     <pic:cNvPicPr/>
                   </pic:nvPicPr>
                   <pic:blipFill>
-                    <a:blip r:embed="rId17"/>
+                    <a:blip r:embed="rId18"/>
                     <a:stretch>
                       <a:fillRect/>
                     </a:stretch>
@@ -2004,6 +2434,7 @@
       </w:pPr>
       <w:r>
         <w:rPr>
+          <w:noProof/>
           <w:sz w:val="28"/>
           <w:szCs w:val="28"/>
           <w:lang w:val="en-GB"/>
@@ -2025,7 +2456,7 @@
                     <pic:cNvPicPr/>
                   </pic:nvPicPr>
                   <pic:blipFill>
-                    <a:blip r:embed="rId18"/>
+                    <a:blip r:embed="rId19"/>
                     <a:stretch>
                       <a:fillRect/>
                     </a:stretch>
@@ -2053,6 +2484,7 @@
       </w:r>
       <w:r>
         <w:rPr>
+          <w:noProof/>
           <w:sz w:val="28"/>
           <w:szCs w:val="28"/>
           <w:lang w:val="en-GB"/>
@@ -2073,7 +2505,7 @@
                     <pic:cNvPicPr/>
                   </pic:nvPicPr>
                   <pic:blipFill>
-                    <a:blip r:embed="rId19"/>
+                    <a:blip r:embed="rId20"/>
                     <a:stretch>
                       <a:fillRect/>
                     </a:stretch>
@@ -3069,28 +3501,1839 @@
           <w:sz w:val="14"/>
           <w:szCs w:val="14"/>
         </w:rPr>
-        <w:t>3 4 2 1 1 2 3 1 2 1 3 4 2 4 1 3 1 4 4 2 3 1 2 3 3 2 2 1 2 3 1 2 3 3 3 2 1 1 1 4 1 3 1 3 2 1 1 2</w:t>
-      </w:r>
-    </w:p>
-    <w:p>
-      <w:pPr>
-        <w:spacing w:after="0" w:line="240" w:lineRule="auto"/>
-        <w:rPr>
-          <w:noProof/>
-          <w:sz w:val="14"/>
-          <w:szCs w:val="14"/>
-        </w:rPr>
-      </w:pPr>
-    </w:p>
-    <w:p>
-      <w:pPr>
-        <w:spacing w:after="0" w:line="240" w:lineRule="auto"/>
-        <w:rPr>
-          <w:noProof/>
-          <w:sz w:val="14"/>
-          <w:szCs w:val="14"/>
-        </w:rPr>
-      </w:pPr>
+        <w:t>2 4 2 1 1 2 3 1 3 1 3 4 2 4 1 3 1 4 4 2 3 1 2 3 3 2 2 1 2 3 2 2 3 3 3 2 1 1 1 4 1 3 1 3 2 1 1 2</w:t>
+      </w:r>
+    </w:p>
+    <w:p>
+      <w:pPr>
+        <w:spacing w:after="0" w:line="240" w:lineRule="auto"/>
+        <w:rPr>
+          <w:noProof/>
+          <w:sz w:val="14"/>
+          <w:szCs w:val="14"/>
+        </w:rPr>
+      </w:pPr>
+    </w:p>
+    <w:p>
+      <w:pPr>
+        <w:spacing w:after="0" w:line="240" w:lineRule="auto"/>
+        <w:rPr>
+          <w:noProof/>
+          <w:sz w:val="14"/>
+          <w:szCs w:val="14"/>
+        </w:rPr>
+      </w:pPr>
+    </w:p>
+    <w:p>
+      <w:pPr>
+        <w:spacing w:after="0" w:line="240" w:lineRule="auto"/>
+        <w:rPr>
+          <w:noProof/>
+          <w:sz w:val="14"/>
+          <w:szCs w:val="14"/>
+        </w:rPr>
+      </w:pPr>
+      <w:r>
+        <w:rPr>
+          <w:noProof/>
+          <w:sz w:val="14"/>
+          <w:szCs w:val="14"/>
+        </w:rPr>
+        <w:t>Egypt:</w:t>
+      </w:r>
+    </w:p>
+    <w:p>
+      <w:pPr>
+        <w:spacing w:after="0" w:line="240" w:lineRule="auto"/>
+        <w:rPr>
+          <w:noProof/>
+          <w:sz w:val="14"/>
+          <w:szCs w:val="14"/>
+        </w:rPr>
+      </w:pPr>
+    </w:p>
+    <w:p>
+      <w:pPr>
+        <w:spacing w:after="0" w:line="240" w:lineRule="auto"/>
+        <w:rPr>
+          <w:noProof/>
+          <w:sz w:val="14"/>
+          <w:szCs w:val="14"/>
+        </w:rPr>
+      </w:pPr>
+      <w:r>
+        <w:rPr>
+          <w:noProof/>
+          <w:sz w:val="14"/>
+          <w:szCs w:val="14"/>
+        </w:rPr>
+        <w:t>int egypt_adj[27][27] = {</w:t>
+      </w:r>
+    </w:p>
+    <w:p>
+      <w:pPr>
+        <w:spacing w:after="0" w:line="240" w:lineRule="auto"/>
+        <w:rPr>
+          <w:noProof/>
+          <w:sz w:val="14"/>
+          <w:szCs w:val="14"/>
+        </w:rPr>
+      </w:pPr>
+    </w:p>
+    <w:p>
+      <w:pPr>
+        <w:spacing w:after="0" w:line="240" w:lineRule="auto"/>
+        <w:rPr>
+          <w:noProof/>
+          <w:sz w:val="14"/>
+          <w:szCs w:val="14"/>
+        </w:rPr>
+      </w:pPr>
+      <w:r>
+        <w:rPr>
+          <w:noProof/>
+          <w:sz w:val="14"/>
+          <w:szCs w:val="14"/>
+        </w:rPr>
+        <w:t>{0,0,0,1,0,0,0,0,0,0,0,0,0,0,1,0,0,0,0,0,0,0,0,0,0,0,0}, // Alexandria</w:t>
+      </w:r>
+    </w:p>
+    <w:p>
+      <w:pPr>
+        <w:spacing w:after="0" w:line="240" w:lineRule="auto"/>
+        <w:rPr>
+          <w:noProof/>
+          <w:sz w:val="14"/>
+          <w:szCs w:val="14"/>
+        </w:rPr>
+      </w:pPr>
+      <w:r>
+        <w:rPr>
+          <w:noProof/>
+          <w:sz w:val="14"/>
+          <w:szCs w:val="14"/>
+        </w:rPr>
+        <w:t>{0,0,0,0,0,0,0,0,0,0,0,0,0,1,0,0,1,0,0,0,0,1,1,0,0,0,0}, // Aswan</w:t>
+      </w:r>
+    </w:p>
+    <w:p>
+      <w:pPr>
+        <w:spacing w:after="0" w:line="240" w:lineRule="auto"/>
+        <w:rPr>
+          <w:noProof/>
+          <w:sz w:val="14"/>
+          <w:szCs w:val="14"/>
+        </w:rPr>
+      </w:pPr>
+      <w:r>
+        <w:rPr>
+          <w:noProof/>
+          <w:sz w:val="14"/>
+          <w:szCs w:val="14"/>
+        </w:rPr>
+        <w:t>{0,0,0,0,1,0,0,0,0,0,0,0,0,0,0,1,0,0,0,0,0,0,0,0,1,0,0}, // Asyut</w:t>
+      </w:r>
+    </w:p>
+    <w:p>
+      <w:pPr>
+        <w:spacing w:after="0" w:line="240" w:lineRule="auto"/>
+        <w:rPr>
+          <w:noProof/>
+          <w:sz w:val="14"/>
+          <w:szCs w:val="14"/>
+        </w:rPr>
+      </w:pPr>
+      <w:r>
+        <w:rPr>
+          <w:noProof/>
+          <w:sz w:val="14"/>
+          <w:szCs w:val="14"/>
+        </w:rPr>
+        <w:t>{1,0,0,0,0,0,1,0,0,1,0,0,1,0,1,0,1,0,0,0,0,0,0,0,0,0,0}, // Beheira</w:t>
+      </w:r>
+    </w:p>
+    <w:p>
+      <w:pPr>
+        <w:spacing w:after="0" w:line="240" w:lineRule="auto"/>
+        <w:rPr>
+          <w:noProof/>
+          <w:sz w:val="14"/>
+          <w:szCs w:val="14"/>
+        </w:rPr>
+      </w:pPr>
+      <w:r>
+        <w:rPr>
+          <w:noProof/>
+          <w:sz w:val="14"/>
+          <w:szCs w:val="14"/>
+        </w:rPr>
+        <w:t>{0,0,1,0,0,0,0,0,1,0,1,0,0,0,0,1,0,0,0,0,1,0,0,0,0,0,0}, // Beni Suef</w:t>
+      </w:r>
+    </w:p>
+    <w:p>
+      <w:pPr>
+        <w:spacing w:after="0" w:line="240" w:lineRule="auto"/>
+        <w:rPr>
+          <w:noProof/>
+          <w:sz w:val="14"/>
+          <w:szCs w:val="14"/>
+        </w:rPr>
+      </w:pPr>
+      <w:r>
+        <w:rPr>
+          <w:noProof/>
+          <w:sz w:val="14"/>
+          <w:szCs w:val="14"/>
+        </w:rPr>
+        <w:t>{0,0,0,0,0,0,0,0,0,0,1,0,0,0,0,0,0,0,0,0,1,0,0,0,0,0,0}, // Cairo</w:t>
+      </w:r>
+    </w:p>
+    <w:p>
+      <w:pPr>
+        <w:spacing w:after="0" w:line="240" w:lineRule="auto"/>
+        <w:rPr>
+          <w:noProof/>
+          <w:sz w:val="14"/>
+          <w:szCs w:val="14"/>
+        </w:rPr>
+      </w:pPr>
+      <w:r>
+        <w:rPr>
+          <w:noProof/>
+          <w:sz w:val="14"/>
+          <w:szCs w:val="14"/>
+        </w:rPr>
+        <w:t>{0,0,0,1,0,0,0,1,0,1,0,0,1,0,0,0,0,0,0,0,0,0,0,1,0,0,0}, // Dakahlia</w:t>
+      </w:r>
+    </w:p>
+    <w:p>
+      <w:pPr>
+        <w:spacing w:after="0" w:line="240" w:lineRule="auto"/>
+        <w:rPr>
+          <w:noProof/>
+          <w:sz w:val="14"/>
+          <w:szCs w:val="14"/>
+        </w:rPr>
+      </w:pPr>
+      <w:r>
+        <w:rPr>
+          <w:noProof/>
+          <w:sz w:val="14"/>
+          <w:szCs w:val="14"/>
+        </w:rPr>
+        <w:t>{0,0,0,0,0,0,1,0,0,0,0,0,0,0,0,0,0,0,0,1,0,0,0,1,0,0,0}, // Damietta</w:t>
+      </w:r>
+    </w:p>
+    <w:p>
+      <w:pPr>
+        <w:spacing w:after="0" w:line="240" w:lineRule="auto"/>
+        <w:rPr>
+          <w:noProof/>
+          <w:sz w:val="14"/>
+          <w:szCs w:val="14"/>
+        </w:rPr>
+      </w:pPr>
+      <w:r>
+        <w:rPr>
+          <w:noProof/>
+          <w:sz w:val="14"/>
+          <w:szCs w:val="14"/>
+        </w:rPr>
+        <w:t>{0,0,0,0,1,0,0,0,0,0,1,0,0,0,0,1,0,0,0,0,0,0,0,0,0,0,0}, // Faiyum</w:t>
+      </w:r>
+    </w:p>
+    <w:p>
+      <w:pPr>
+        <w:spacing w:after="0" w:line="240" w:lineRule="auto"/>
+        <w:rPr>
+          <w:noProof/>
+          <w:sz w:val="14"/>
+          <w:szCs w:val="14"/>
+        </w:rPr>
+      </w:pPr>
+      <w:r>
+        <w:rPr>
+          <w:noProof/>
+          <w:sz w:val="14"/>
+          <w:szCs w:val="14"/>
+        </w:rPr>
+        <w:t>{0,0,0,1,0,0,1,0,0,0,0,0,1,0,0,0,1,0,0,0,0,0,0,1,0,0,0}, // Gharbia</w:t>
+      </w:r>
+    </w:p>
+    <w:p>
+      <w:pPr>
+        <w:spacing w:after="0" w:line="240" w:lineRule="auto"/>
+        <w:rPr>
+          <w:noProof/>
+          <w:sz w:val="14"/>
+          <w:szCs w:val="14"/>
+        </w:rPr>
+      </w:pPr>
+      <w:r>
+        <w:rPr>
+          <w:noProof/>
+          <w:sz w:val="14"/>
+          <w:szCs w:val="14"/>
+        </w:rPr>
+        <w:t>{0,0,0,0,1,1,0,0,1,0,0,0,0,0,1,1,0,1,0,0,1,0,1,0,0,0,0}, // Giza</w:t>
+      </w:r>
+    </w:p>
+    <w:p>
+      <w:pPr>
+        <w:spacing w:after="0" w:line="240" w:lineRule="auto"/>
+        <w:rPr>
+          <w:noProof/>
+          <w:sz w:val="14"/>
+          <w:szCs w:val="14"/>
+        </w:rPr>
+      </w:pPr>
+      <w:r>
+        <w:rPr>
+          <w:noProof/>
+          <w:sz w:val="14"/>
+          <w:szCs w:val="14"/>
+        </w:rPr>
+        <w:t>{0,0,0,0,0,0,0,0,0,0,0,0,0,0,0,0,0,0,1,1,0,0,0,0,0,1,1}, // Ismailia</w:t>
+      </w:r>
+    </w:p>
+    <w:p>
+      <w:pPr>
+        <w:spacing w:after="0" w:line="240" w:lineRule="auto"/>
+        <w:rPr>
+          <w:noProof/>
+          <w:sz w:val="14"/>
+          <w:szCs w:val="14"/>
+        </w:rPr>
+      </w:pPr>
+      <w:r>
+        <w:rPr>
+          <w:noProof/>
+          <w:sz w:val="14"/>
+          <w:szCs w:val="14"/>
+        </w:rPr>
+        <w:t>{0,0,0,1,0,0,1,0,0,1,0,0,0,0,0,0,0,0,0,0,0,0,0,0,0,0,0}, // Kafr El Sheikh</w:t>
+      </w:r>
+    </w:p>
+    <w:p>
+      <w:pPr>
+        <w:spacing w:after="0" w:line="240" w:lineRule="auto"/>
+        <w:rPr>
+          <w:noProof/>
+          <w:sz w:val="14"/>
+          <w:szCs w:val="14"/>
+        </w:rPr>
+      </w:pPr>
+      <w:r>
+        <w:rPr>
+          <w:noProof/>
+          <w:sz w:val="14"/>
+          <w:szCs w:val="14"/>
+        </w:rPr>
+        <w:t>{0,1,0,0,0,0,0,0,0,0,0,0,0,0,0,0,0,0,0,0,0,1,1,0,1,0,0}, // Luxor</w:t>
+      </w:r>
+    </w:p>
+    <w:p>
+      <w:pPr>
+        <w:spacing w:after="0" w:line="240" w:lineRule="auto"/>
+        <w:rPr>
+          <w:noProof/>
+          <w:sz w:val="14"/>
+          <w:szCs w:val="14"/>
+        </w:rPr>
+      </w:pPr>
+      <w:r>
+        <w:rPr>
+          <w:noProof/>
+          <w:sz w:val="14"/>
+          <w:szCs w:val="14"/>
+        </w:rPr>
+        <w:t>{1,0,0,1,0,0,0,0,0,0,1,0,0,0,0,0,0,0,0,0,0,0,0,0,0,0,0}, // Matrouh</w:t>
+      </w:r>
+    </w:p>
+    <w:p>
+      <w:pPr>
+        <w:spacing w:after="0" w:line="240" w:lineRule="auto"/>
+        <w:rPr>
+          <w:noProof/>
+          <w:sz w:val="14"/>
+          <w:szCs w:val="14"/>
+        </w:rPr>
+      </w:pPr>
+      <w:r>
+        <w:rPr>
+          <w:noProof/>
+          <w:sz w:val="14"/>
+          <w:szCs w:val="14"/>
+        </w:rPr>
+        <w:t>{0,0,1,0,1,0,0,0,1,0,1,0,0,0,0,0,0,1,0,0,0,0,1,0,1,0,0}, // Minya</w:t>
+      </w:r>
+    </w:p>
+    <w:p>
+      <w:pPr>
+        <w:spacing w:after="0" w:line="240" w:lineRule="auto"/>
+        <w:rPr>
+          <w:noProof/>
+          <w:sz w:val="14"/>
+          <w:szCs w:val="14"/>
+        </w:rPr>
+      </w:pPr>
+      <w:r>
+        <w:rPr>
+          <w:noProof/>
+          <w:sz w:val="14"/>
+          <w:szCs w:val="14"/>
+        </w:rPr>
+        <w:t>{0,0,0,1,0,0,0,0,0,1,0,0,0,0,0,0,0,0,0,0,1,0,0,0,0,0,0}, // Monufia</w:t>
+      </w:r>
+    </w:p>
+    <w:p>
+      <w:pPr>
+        <w:spacing w:after="0" w:line="240" w:lineRule="auto"/>
+        <w:rPr>
+          <w:noProof/>
+          <w:sz w:val="14"/>
+          <w:szCs w:val="14"/>
+        </w:rPr>
+      </w:pPr>
+      <w:r>
+        <w:rPr>
+          <w:noProof/>
+          <w:sz w:val="14"/>
+          <w:szCs w:val="14"/>
+        </w:rPr>
+        <w:t>{0,1,0,0,0,0,0,0,0,0,1,0,0,0,0,1,0,0,0,0,0,0,1,0,0,0,0}, // New Valley</w:t>
+      </w:r>
+    </w:p>
+    <w:p>
+      <w:pPr>
+        <w:spacing w:after="0" w:line="240" w:lineRule="auto"/>
+        <w:rPr>
+          <w:noProof/>
+          <w:sz w:val="14"/>
+          <w:szCs w:val="14"/>
+        </w:rPr>
+      </w:pPr>
+      <w:r>
+        <w:rPr>
+          <w:noProof/>
+          <w:sz w:val="14"/>
+          <w:szCs w:val="14"/>
+        </w:rPr>
+        <w:t>{0,0,0,0,0,0,0,0,0,0,0,1,0,0,0,0,0,0,0,0,0,0,0,0,0,1,0}, // North Sinai</w:t>
+      </w:r>
+    </w:p>
+    <w:p>
+      <w:pPr>
+        <w:spacing w:after="0" w:line="240" w:lineRule="auto"/>
+        <w:rPr>
+          <w:noProof/>
+          <w:sz w:val="14"/>
+          <w:szCs w:val="14"/>
+        </w:rPr>
+      </w:pPr>
+      <w:r>
+        <w:rPr>
+          <w:noProof/>
+          <w:sz w:val="14"/>
+          <w:szCs w:val="14"/>
+        </w:rPr>
+        <w:t>{0,0,0,0,0,0,0,1,0,0,0,1,0,0,0,0,0,0,0,0,0,0,0,0,0,0,0}, // Port Said</w:t>
+      </w:r>
+    </w:p>
+    <w:p>
+      <w:pPr>
+        <w:spacing w:after="0" w:line="240" w:lineRule="auto"/>
+        <w:rPr>
+          <w:noProof/>
+          <w:sz w:val="14"/>
+          <w:szCs w:val="14"/>
+        </w:rPr>
+      </w:pPr>
+      <w:r>
+        <w:rPr>
+          <w:noProof/>
+          <w:sz w:val="14"/>
+          <w:szCs w:val="14"/>
+        </w:rPr>
+        <w:t>{0,0,0,0,1,1,0,0,0,0,1,0,0,0,0,0,1,0,0,0,0,0,0,1,0,0,0}, // Qalyubia</w:t>
+      </w:r>
+    </w:p>
+    <w:p>
+      <w:pPr>
+        <w:spacing w:after="0" w:line="240" w:lineRule="auto"/>
+        <w:rPr>
+          <w:noProof/>
+          <w:sz w:val="14"/>
+          <w:szCs w:val="14"/>
+        </w:rPr>
+      </w:pPr>
+      <w:r>
+        <w:rPr>
+          <w:noProof/>
+          <w:sz w:val="14"/>
+          <w:szCs w:val="14"/>
+        </w:rPr>
+        <w:t>{0,1,0,0,0,0,0,0,0,0,0,0,0,1,0,0,0,0,0,0,0,0,1,0,1,0,0}, // Qena</w:t>
+      </w:r>
+    </w:p>
+    <w:p>
+      <w:pPr>
+        <w:spacing w:after="0" w:line="240" w:lineRule="auto"/>
+        <w:rPr>
+          <w:noProof/>
+          <w:sz w:val="14"/>
+          <w:szCs w:val="14"/>
+        </w:rPr>
+      </w:pPr>
+      <w:r>
+        <w:rPr>
+          <w:noProof/>
+          <w:sz w:val="14"/>
+          <w:szCs w:val="14"/>
+        </w:rPr>
+        <w:t>{0,1,0,0,0,0,0,0,0,0,1,0,0,1,0,1,0,1,0,0,0,1,0,0,0,0,0}, // Red Sea</w:t>
+      </w:r>
+    </w:p>
+    <w:p>
+      <w:pPr>
+        <w:spacing w:after="0" w:line="240" w:lineRule="auto"/>
+        <w:rPr>
+          <w:noProof/>
+          <w:sz w:val="14"/>
+          <w:szCs w:val="14"/>
+        </w:rPr>
+      </w:pPr>
+      <w:r>
+        <w:rPr>
+          <w:noProof/>
+          <w:sz w:val="14"/>
+          <w:szCs w:val="14"/>
+        </w:rPr>
+        <w:t>{0,0,0,0,0,0,1,1,0,1,0,0,0,0,0,0,0,0,0,0,1,0,0,0,0,0,0}, // Sharqia</w:t>
+      </w:r>
+    </w:p>
+    <w:p>
+      <w:pPr>
+        <w:spacing w:after="0" w:line="240" w:lineRule="auto"/>
+        <w:rPr>
+          <w:noProof/>
+          <w:sz w:val="14"/>
+          <w:szCs w:val="14"/>
+        </w:rPr>
+      </w:pPr>
+      <w:r>
+        <w:rPr>
+          <w:noProof/>
+          <w:sz w:val="14"/>
+          <w:szCs w:val="14"/>
+        </w:rPr>
+        <w:t>{0,0,1,0,0,0,0,0,0,0,0,0,0,1,0,1,0,0,0,0,0,1,0,0,0,0,0}, // Sohag</w:t>
+      </w:r>
+    </w:p>
+    <w:p>
+      <w:pPr>
+        <w:spacing w:after="0" w:line="240" w:lineRule="auto"/>
+        <w:rPr>
+          <w:noProof/>
+          <w:sz w:val="14"/>
+          <w:szCs w:val="14"/>
+        </w:rPr>
+      </w:pPr>
+      <w:r>
+        <w:rPr>
+          <w:noProof/>
+          <w:sz w:val="14"/>
+          <w:szCs w:val="14"/>
+        </w:rPr>
+        <w:t>{0,0,0,0,0,0,0,0,0,0,0,1,0,0,0,0,0,0,1,0,0,0,0,0,0,0,1}, // South Sinai</w:t>
+      </w:r>
+    </w:p>
+    <w:p>
+      <w:pPr>
+        <w:spacing w:after="0" w:line="240" w:lineRule="auto"/>
+        <w:rPr>
+          <w:noProof/>
+          <w:sz w:val="14"/>
+          <w:szCs w:val="14"/>
+        </w:rPr>
+      </w:pPr>
+      <w:r>
+        <w:rPr>
+          <w:noProof/>
+          <w:sz w:val="14"/>
+          <w:szCs w:val="14"/>
+        </w:rPr>
+        <w:t>{0,0,0,0,0,0,0,0,0,0,0,1,0,0,0,0,0,0,0,0,0,0,0,0,0,1,0}  // Suez</w:t>
+      </w:r>
+    </w:p>
+    <w:p>
+      <w:pPr>
+        <w:spacing w:after="0" w:line="240" w:lineRule="auto"/>
+        <w:rPr>
+          <w:noProof/>
+          <w:sz w:val="14"/>
+          <w:szCs w:val="14"/>
+        </w:rPr>
+      </w:pPr>
+    </w:p>
+    <w:p>
+      <w:pPr>
+        <w:spacing w:after="0" w:line="240" w:lineRule="auto"/>
+        <w:rPr>
+          <w:noProof/>
+          <w:sz w:val="14"/>
+          <w:szCs w:val="14"/>
+        </w:rPr>
+      </w:pPr>
+      <w:r>
+        <w:rPr>
+          <w:noProof/>
+          <w:sz w:val="14"/>
+          <w:szCs w:val="14"/>
+        </w:rPr>
+        <w:t>};</w:t>
+      </w:r>
+    </w:p>
+    <w:p>
+      <w:pPr>
+        <w:spacing w:after="0" w:line="240" w:lineRule="auto"/>
+        <w:rPr>
+          <w:noProof/>
+          <w:sz w:val="14"/>
+          <w:szCs w:val="14"/>
+        </w:rPr>
+      </w:pPr>
+    </w:p>
+    <w:p>
+      <w:pPr>
+        <w:spacing w:after="0" w:line="240" w:lineRule="auto"/>
+        <w:rPr>
+          <w:noProof/>
+          <w:sz w:val="14"/>
+          <w:szCs w:val="14"/>
+        </w:rPr>
+      </w:pPr>
+      <w:r>
+        <w:rPr>
+          <w:noProof/>
+          <w:sz w:val="14"/>
+          <w:szCs w:val="14"/>
+        </w:rPr>
+        <w:t>int ukraine_adj[24][24] = {</w:t>
+      </w:r>
+      <w:r>
+        <w:rPr>
+          <w:noProof/>
+          <w:sz w:val="14"/>
+          <w:szCs w:val="14"/>
+        </w:rPr>
+        <w:br/>
+      </w:r>
+      <w:r>
+        <w:rPr>
+          <w:noProof/>
+          <w:sz w:val="14"/>
+          <w:szCs w:val="14"/>
+        </w:rPr>
+        <w:br/>
+        <w:t>{0,1,1,0,0,0,0,0,0,0,0,0,0,0,0,0,0,0,0,0,0,0,0,0}, // Volyn</w:t>
+      </w:r>
+      <w:r>
+        <w:rPr>
+          <w:noProof/>
+          <w:sz w:val="14"/>
+          <w:szCs w:val="14"/>
+        </w:rPr>
+        <w:br/>
+        <w:t>{1,0,0,0,0,0,0,0,1,0,0,0,0,0,0,0,0,0,0,0,0,0,0,0}, // Rivne</w:t>
+      </w:r>
+      <w:r>
+        <w:rPr>
+          <w:noProof/>
+          <w:sz w:val="14"/>
+          <w:szCs w:val="14"/>
+        </w:rPr>
+        <w:br/>
+        <w:t>{1,0,0,1,1,0,0,0,0,0,0,0,0,0,0,0,0,0,0,0,0,0,0,0}, // Lviv</w:t>
+      </w:r>
+      <w:r>
+        <w:rPr>
+          <w:noProof/>
+          <w:sz w:val="14"/>
+          <w:szCs w:val="14"/>
+        </w:rPr>
+        <w:br/>
+        <w:t>{0,0,1,0,1,0,0,0,0,0,0,0,0,0,0,0,0,0,0,0,0,0,0,0}, // Zakarpattia</w:t>
+      </w:r>
+      <w:r>
+        <w:rPr>
+          <w:noProof/>
+          <w:sz w:val="14"/>
+          <w:szCs w:val="14"/>
+        </w:rPr>
+        <w:br/>
+        <w:t>{0,0,1,1,0,1,1,0,0,0,0,0,0,0,0,0,0,0,0,0,0,0,0,0}, // Ivano-Frankivsk</w:t>
+      </w:r>
+      <w:r>
+        <w:rPr>
+          <w:noProof/>
+          <w:sz w:val="14"/>
+          <w:szCs w:val="14"/>
+        </w:rPr>
+        <w:br/>
+        <w:t>{0,0,0,0,1,0,0,1,0,0,0,0,0,0,0,0,0,0,0,0,1,0,0,0}, // Ternopil</w:t>
+      </w:r>
+      <w:r>
+        <w:rPr>
+          <w:noProof/>
+          <w:sz w:val="14"/>
+          <w:szCs w:val="14"/>
+        </w:rPr>
+        <w:br/>
+        <w:t>{0,0,0,0,1,0,0,0,0,0,0,0,0,0,0,0,0,0,0,0,1,0,0,0}, // Chernivtsi</w:t>
+      </w:r>
+      <w:r>
+        <w:rPr>
+          <w:noProof/>
+          <w:sz w:val="14"/>
+          <w:szCs w:val="14"/>
+        </w:rPr>
+        <w:br/>
+        <w:t>{0,0,0,0,0,1,0,0,1,0,0,0,0,0,0,0,0,0,0,0,1,0,0,0}, // Khmelnytskyi</w:t>
+      </w:r>
+      <w:r>
+        <w:rPr>
+          <w:noProof/>
+          <w:sz w:val="14"/>
+          <w:szCs w:val="14"/>
+        </w:rPr>
+        <w:br/>
+        <w:t>{0,1,0,0,0,0,0,1,0,1,1,0,0,0,0,0,0,0,0,0,1,0,0,0}, // Zhytomyr</w:t>
+      </w:r>
+      <w:r>
+        <w:rPr>
+          <w:noProof/>
+          <w:sz w:val="14"/>
+          <w:szCs w:val="14"/>
+        </w:rPr>
+        <w:br/>
+        <w:t>{0,0,0,0,0,0,0,0,1,0,1,0,0,0,0,0,0,0,0,1,0,0,0,0}, // Kyiv</w:t>
+      </w:r>
+      <w:r>
+        <w:rPr>
+          <w:noProof/>
+          <w:sz w:val="14"/>
+          <w:szCs w:val="14"/>
+        </w:rPr>
+        <w:br/>
+        <w:t>{0,0,0,0,0,0,0,0,1,1,0,1,0,0,0,0,0,0,0,0,0,0,0,0}, // Chernihiv</w:t>
+      </w:r>
+      <w:r>
+        <w:rPr>
+          <w:noProof/>
+          <w:sz w:val="14"/>
+          <w:szCs w:val="14"/>
+        </w:rPr>
+        <w:br/>
+        <w:t>{0,0,0,0,0,0,0,0,0,0,1,0,1,1,0,0,0,0,0,0,0,0,0,0}, // Sumy</w:t>
+      </w:r>
+      <w:r>
+        <w:rPr>
+          <w:noProof/>
+          <w:sz w:val="14"/>
+          <w:szCs w:val="14"/>
+        </w:rPr>
+        <w:br/>
+        <w:t>{0,0,0,0,0,0,0,0,0,0,0,1,0,1,0,0,0,1,0,1,0,0,0,0}, // Poltava</w:t>
+      </w:r>
+      <w:r>
+        <w:rPr>
+          <w:noProof/>
+          <w:sz w:val="14"/>
+          <w:szCs w:val="14"/>
+        </w:rPr>
+        <w:br/>
+        <w:t>{0,0,0,0,0,0,0,0,0,0,0,1,1,0,1,1,0,1,0,0,0,0,0,0}, // Kharkiv</w:t>
+      </w:r>
+      <w:r>
+        <w:rPr>
+          <w:noProof/>
+          <w:sz w:val="14"/>
+          <w:szCs w:val="14"/>
+        </w:rPr>
+        <w:br/>
+        <w:t>{0,0,0,0,0,0,0,0,0,0,0,0,0,1,0,1,0,0,0,0,0,0,0,0}, // Luhansk</w:t>
+      </w:r>
+      <w:r>
+        <w:rPr>
+          <w:noProof/>
+          <w:sz w:val="14"/>
+          <w:szCs w:val="14"/>
+        </w:rPr>
+        <w:br/>
+        <w:t>{0,0,0,0,0,0,0,0,0,0,0,0,0,1,1,0,1,1,0,0,0,0,0,0}, // Donetsk</w:t>
+      </w:r>
+      <w:r>
+        <w:rPr>
+          <w:noProof/>
+          <w:sz w:val="14"/>
+          <w:szCs w:val="14"/>
+        </w:rPr>
+        <w:br/>
+        <w:t>{0,0,0,0,0,0,0,0,0,0,0,0,0,0,0,1,0,1,0,0,0,0,1,1}, // Zaporizhzhia</w:t>
+      </w:r>
+      <w:r>
+        <w:rPr>
+          <w:noProof/>
+          <w:sz w:val="14"/>
+          <w:szCs w:val="14"/>
+        </w:rPr>
+        <w:br/>
+        <w:t>{0,0,0,0,0,0,0,0,0,0,0,0,1,1,0,1,1,0,1,0,0,0,1,0}, // Dnipropetrovsk</w:t>
+      </w:r>
+      <w:r>
+        <w:rPr>
+          <w:noProof/>
+          <w:sz w:val="14"/>
+          <w:szCs w:val="14"/>
+        </w:rPr>
+        <w:br/>
+        <w:t>{0,0,0,0,0,0,0,0,0,0,0,0,0,0,0,0,0,1,0,1,1,0,1,0}, // Kirovohrad</w:t>
+      </w:r>
+      <w:r>
+        <w:rPr>
+          <w:noProof/>
+          <w:sz w:val="14"/>
+          <w:szCs w:val="14"/>
+        </w:rPr>
+        <w:br/>
+        <w:t>{0,0,0,0,0,0,0,0,0,1,0,0,1,0,0,0,0,0,1,0,1,0,0,0}, // Cherkasy</w:t>
+      </w:r>
+      <w:r>
+        <w:rPr>
+          <w:noProof/>
+          <w:sz w:val="14"/>
+          <w:szCs w:val="14"/>
+        </w:rPr>
+        <w:br/>
+      </w:r>
+      <w:r>
+        <w:rPr>
+          <w:noProof/>
+          <w:sz w:val="14"/>
+          <w:szCs w:val="14"/>
+        </w:rPr>
+        <w:lastRenderedPageBreak/>
+        <w:t>{0,0,0,0,0,1,1,1,1,0,0,0,0,0,0,0,0,0,1,1,0,1,0,0}, // Vinnytsia</w:t>
+      </w:r>
+      <w:r>
+        <w:rPr>
+          <w:noProof/>
+          <w:sz w:val="14"/>
+          <w:szCs w:val="14"/>
+        </w:rPr>
+        <w:br/>
+        <w:t>{0,0,0,0,0,0,0,0,0,0,0,0,0,0,0,0,0,0,0,0,1,0,1,0}, // Odesa</w:t>
+      </w:r>
+      <w:r>
+        <w:rPr>
+          <w:noProof/>
+          <w:sz w:val="14"/>
+          <w:szCs w:val="14"/>
+        </w:rPr>
+        <w:br/>
+        <w:t>{0,0,0,0,0,0,0,0,0,0,0,0,0,0,0,0,1,1,1,0,0,1,0,1}, // Mykolaiv</w:t>
+      </w:r>
+      <w:r>
+        <w:rPr>
+          <w:noProof/>
+          <w:sz w:val="14"/>
+          <w:szCs w:val="14"/>
+        </w:rPr>
+        <w:br/>
+        <w:t>{0,0,0,0,0,0,0,0,0,0,0,0,0,0,0,0,1,0,0,0,0,0,1,0} // Kherson</w:t>
+      </w:r>
+      <w:r>
+        <w:rPr>
+          <w:noProof/>
+          <w:sz w:val="14"/>
+          <w:szCs w:val="14"/>
+        </w:rPr>
+        <w:br/>
+      </w:r>
+      <w:r>
+        <w:rPr>
+          <w:noProof/>
+          <w:sz w:val="14"/>
+          <w:szCs w:val="14"/>
+        </w:rPr>
+        <w:br/>
+        <w:t>};</w:t>
+      </w:r>
+    </w:p>
+    <w:p>
+      <w:pPr>
+        <w:spacing w:after="0" w:line="240" w:lineRule="auto"/>
+        <w:rPr>
+          <w:noProof/>
+          <w:sz w:val="14"/>
+          <w:szCs w:val="14"/>
+        </w:rPr>
+      </w:pPr>
+    </w:p>
+    <w:p>
+      <w:pPr>
+        <w:spacing w:after="0" w:line="240" w:lineRule="auto"/>
+        <w:rPr>
+          <w:noProof/>
+          <w:sz w:val="14"/>
+          <w:szCs w:val="14"/>
+        </w:rPr>
+      </w:pPr>
+      <w:r>
+        <w:rPr>
+          <w:noProof/>
+          <w:sz w:val="14"/>
+          <w:szCs w:val="14"/>
+        </w:rPr>
+        <w:t>int china_adj[34][34] = {</w:t>
+      </w:r>
+      <w:r>
+        <w:rPr>
+          <w:noProof/>
+          <w:sz w:val="14"/>
+          <w:szCs w:val="14"/>
+        </w:rPr>
+        <w:br/>
+      </w:r>
+      <w:r>
+        <w:rPr>
+          <w:noProof/>
+          <w:sz w:val="14"/>
+          <w:szCs w:val="14"/>
+        </w:rPr>
+        <w:br/>
+        <w:t>{0,0,0,0,0,0,0,0,0,0,0,1,1,0,1,1,0,0,0,0,0,0,1,0,0,0,0,0,0,1,0,0,0,0}, // Anhui</w:t>
+      </w:r>
+      <w:r>
+        <w:rPr>
+          <w:noProof/>
+          <w:sz w:val="14"/>
+          <w:szCs w:val="14"/>
+        </w:rPr>
+        <w:br/>
+        <w:t>{0,0,0,0,0,0,0,0,0,1,0,0,0,0,0,0,0,0,1,0,0,0,0,0,0,0,0,0,0,0,0,0,0,1}, // Beijing</w:t>
+      </w:r>
+      <w:r>
+        <w:rPr>
+          <w:noProof/>
+          <w:sz w:val="14"/>
+          <w:szCs w:val="14"/>
+        </w:rPr>
+        <w:br/>
+        <w:t>{0,0,0,0,0,0,0,1,0,0,0,0,1,1,0,0,0,0,0,0,0,1,0,0,0,1,1,0,1,0,0,0,0,0}, // Chongqing</w:t>
+      </w:r>
+      <w:r>
+        <w:rPr>
+          <w:noProof/>
+          <w:sz w:val="14"/>
+          <w:szCs w:val="14"/>
+        </w:rPr>
+        <w:br/>
+        <w:t>{0,0,0,0,0,1,0,0,0,0,0,0,0,0,0,1,0,0,0,0,0,0,0,0,0,0,0,0,0,1,0,0,0,0}, // Fujian</w:t>
+      </w:r>
+      <w:r>
+        <w:rPr>
+          <w:noProof/>
+          <w:sz w:val="14"/>
+          <w:szCs w:val="14"/>
+        </w:rPr>
+        <w:br/>
+        <w:t>{0,0,0,0,0,0,0,0,0,0,0,0,0,0,0,0,0,0,1,1,1,1,0,0,0,1,0,1,0,0,0,0,0,0}, // Gansu</w:t>
+      </w:r>
+      <w:r>
+        <w:rPr>
+          <w:noProof/>
+          <w:sz w:val="14"/>
+          <w:szCs w:val="14"/>
+        </w:rPr>
+        <w:br/>
+        <w:t>{0,0,0,1,0,0,1,0,0,0,0,0,0,0,0,1,0,0,0,0,0,0,0,0,0,0,0,0,0,0,1,1,0,0}, // Guangdong</w:t>
+      </w:r>
+      <w:r>
+        <w:rPr>
+          <w:noProof/>
+          <w:sz w:val="14"/>
+          <w:szCs w:val="14"/>
+        </w:rPr>
+        <w:br/>
+        <w:t>{0,0,0,0,0,1,0,1,0,0,0,0,0,0,0,0,0,0,0,0,0,0,0,0,0,0,0,0,1,0,0,0,0,0}, // Guangxi</w:t>
+      </w:r>
+      <w:r>
+        <w:rPr>
+          <w:noProof/>
+          <w:sz w:val="14"/>
+          <w:szCs w:val="14"/>
+        </w:rPr>
+        <w:br/>
+        <w:t>{0,0,1,0,0,0,1,0,0,0,0,0,0,1,0,0,0,0,0,0,0,0,0,0,0,1,0,0,1,0,0,0,0,0}, // Guizhou</w:t>
+      </w:r>
+      <w:r>
+        <w:rPr>
+          <w:noProof/>
+          <w:sz w:val="14"/>
+          <w:szCs w:val="14"/>
+        </w:rPr>
+        <w:br/>
+        <w:t>{0,0,0,0,0,0,0,0,0,0,0,0,0,0,0,0,0,0,0,0,0,0,0,0,0,0,0,0,0,0,0,0,0,0}, // Hainan</w:t>
+      </w:r>
+      <w:r>
+        <w:rPr>
+          <w:noProof/>
+          <w:sz w:val="14"/>
+          <w:szCs w:val="14"/>
+        </w:rPr>
+        <w:br/>
+        <w:t>{0,1,0,0,0,0,0,0,0,0,0,1,0,0,0,0,0,1,1,0,0,0,0,0,1,0,0,0,0,0,0,0,0,1}, // Hebei</w:t>
+      </w:r>
+      <w:r>
+        <w:rPr>
+          <w:noProof/>
+          <w:sz w:val="14"/>
+          <w:szCs w:val="14"/>
+        </w:rPr>
+        <w:br/>
+        <w:t>{0,0,0,0,0,0,0,0,0,0,0,0,0,0,0,0,1,1,1,0,0,0,0,0,0,0,0,0,0,0,0,0,0,0}, // Heilongjiang</w:t>
+      </w:r>
+      <w:r>
+        <w:rPr>
+          <w:noProof/>
+          <w:sz w:val="14"/>
+          <w:szCs w:val="14"/>
+        </w:rPr>
+        <w:br/>
+        <w:t>{1,0,0,0,0,0,0,0,0,1,0,0,1,1,0,0,0,0,0,0,0,1,1,0,1,0,0,0,0,0,0,0,0,0}, // Henan</w:t>
+      </w:r>
+      <w:r>
+        <w:rPr>
+          <w:noProof/>
+          <w:sz w:val="14"/>
+          <w:szCs w:val="14"/>
+        </w:rPr>
+        <w:br/>
+        <w:t>{1,0,1,0,0,0,0,0,0,0,0,1,0,1,0,1,0,0,0,0,0,1,0,0,0,1,0,0,0,0,0,0,0,0}, // Hubei</w:t>
+      </w:r>
+      <w:r>
+        <w:rPr>
+          <w:noProof/>
+          <w:sz w:val="14"/>
+          <w:szCs w:val="14"/>
+        </w:rPr>
+        <w:br/>
+        <w:t>{0,0,1,0,0,0,0,1,0,0,0,1,1,0,0,1,0,0,0,0,0,0,0,0,0,1,0,0,1,0,0,0,0,0}, // Hunan</w:t>
+      </w:r>
+      <w:r>
+        <w:rPr>
+          <w:noProof/>
+          <w:sz w:val="14"/>
+          <w:szCs w:val="14"/>
+        </w:rPr>
+        <w:br/>
+        <w:t>{1,0,0,0,0,0,0,0,0,0,0,0,0,0,0,0,0,0,0,0,0,0,1,1,0,0,0,0,0,1,0,0,0,0}, // Jiangsu</w:t>
+      </w:r>
+      <w:r>
+        <w:rPr>
+          <w:noProof/>
+          <w:sz w:val="14"/>
+          <w:szCs w:val="14"/>
+        </w:rPr>
+        <w:br/>
+        <w:t>{1,0,0,1,0,1,0,0,0,0,0,0,1,1,0,0,0,0,0,0,0,0,0,0,0,0,0,0,0,1,0,0,0,0}, // Jiangxi</w:t>
+      </w:r>
+      <w:r>
+        <w:rPr>
+          <w:noProof/>
+          <w:sz w:val="14"/>
+          <w:szCs w:val="14"/>
+        </w:rPr>
+        <w:br/>
+        <w:t>{0,0,0,0,0,0,0,0,0,0,1,0,0,0,0,0,0,1,1,0,0,0,0,0,0,0,0,0,0,0,0,0,0,0}, // Jilin</w:t>
+      </w:r>
+      <w:r>
+        <w:rPr>
+          <w:noProof/>
+          <w:sz w:val="14"/>
+          <w:szCs w:val="14"/>
+        </w:rPr>
+        <w:br/>
+        <w:t>{0,0,0,0,0,0,0,0,0,1,1,0,0,0,0,0,1,0,1,0,0,0,0,0,0,0,0,0,0,0,0,0,0,0}, // Liaoning</w:t>
+      </w:r>
+      <w:r>
+        <w:rPr>
+          <w:noProof/>
+          <w:sz w:val="14"/>
+          <w:szCs w:val="14"/>
+        </w:rPr>
+        <w:br/>
+        <w:t>{0,1,0,0,1,0,0,0,0,1,1,0,0,0,0,0,1,1,0,1,0,1,0,0,1,0,0,0,0,0,0,0,0,0}, // Inner Mongolia</w:t>
+      </w:r>
+      <w:r>
+        <w:rPr>
+          <w:noProof/>
+          <w:sz w:val="14"/>
+          <w:szCs w:val="14"/>
+        </w:rPr>
+        <w:br/>
+        <w:t>{0,0,0,0,1,0,0,0,0,0,0,0,0,0,0,0,0,0,1,0,0,1,0,0,0,0,0,0,0,0,0,0,0,0}, // Ningxia</w:t>
+      </w:r>
+      <w:r>
+        <w:rPr>
+          <w:noProof/>
+          <w:sz w:val="14"/>
+          <w:szCs w:val="14"/>
+        </w:rPr>
+        <w:br/>
+        <w:t>{0,0,0,0,1,0,0,0,0,0,0,0,0,0,0,0,0,0,0,0,0,1,1,0,0,1,1,1,0,0,0,0,0,0}, // Qinghai</w:t>
+      </w:r>
+      <w:r>
+        <w:rPr>
+          <w:noProof/>
+          <w:sz w:val="14"/>
+          <w:szCs w:val="14"/>
+        </w:rPr>
+        <w:br/>
+        <w:t>{0,0,1,0,1,0,0,0,0,0,0,1,1,0,0,0,0,0,1,1,1,0,0,0,1,1,1,0,0,0,0,0,0,0}, // Shaanxi</w:t>
+      </w:r>
+      <w:r>
+        <w:rPr>
+          <w:noProof/>
+          <w:sz w:val="14"/>
+          <w:szCs w:val="14"/>
+        </w:rPr>
+        <w:br/>
+        <w:t>{1,0,0,0,0,0,0,0,0,0,0,1,0,0,1,0,0,0,0,0,1,0,0,1,0,0,0,0,0,0,0,0,0,0}, // Shandong</w:t>
+      </w:r>
+      <w:r>
+        <w:rPr>
+          <w:noProof/>
+          <w:sz w:val="14"/>
+          <w:szCs w:val="14"/>
+        </w:rPr>
+        <w:br/>
+        <w:t>{0,0,0,0,0,0,0,0,0,0,0,0,0,0,1,0,0,0,0,0,0,0,1,0,0,0,0,0,0,0,0,0,0,0}, // Shanghai</w:t>
+      </w:r>
+      <w:r>
+        <w:rPr>
+          <w:noProof/>
+          <w:sz w:val="14"/>
+          <w:szCs w:val="14"/>
+        </w:rPr>
+        <w:br/>
+        <w:t>{0,0,0,0,0,0,0,0,0,1,0,1,0,0,0,0,0,0,1,0,0,1,0,0,0,0,0,0,0,0,0,0,0,0}, // Shanxi</w:t>
+      </w:r>
+      <w:r>
+        <w:rPr>
+          <w:noProof/>
+          <w:sz w:val="14"/>
+          <w:szCs w:val="14"/>
+        </w:rPr>
+        <w:br/>
+        <w:t>{0,0,1,0,1,0,0,1,0,0,0,0,1,1,0,0,0,0,0,0,1,1,0,0,0,0,1,0,1,0,0,0,0,0}, // Sichuan</w:t>
+      </w:r>
+      <w:r>
+        <w:rPr>
+          <w:noProof/>
+          <w:sz w:val="14"/>
+          <w:szCs w:val="14"/>
+        </w:rPr>
+        <w:br/>
+        <w:t>{0,0,1,0,0,0,0,0,0,0,0,0,0,0,0,0,0,0,0,0,1,1,0,0,0,1,0,0,0,0,0,0,0,0}, // Tibet</w:t>
+      </w:r>
+      <w:r>
+        <w:rPr>
+          <w:noProof/>
+          <w:sz w:val="14"/>
+          <w:szCs w:val="14"/>
+        </w:rPr>
+        <w:br/>
+        <w:t>{0,0,0,0,1,0,0,0,0,0,0,0,0,0,0,0,0,0,0,0,1,0,0,0,0,0,0,0,0,0,0,0,0,0}, // Xinjiang</w:t>
+      </w:r>
+      <w:r>
+        <w:rPr>
+          <w:noProof/>
+          <w:sz w:val="14"/>
+          <w:szCs w:val="14"/>
+        </w:rPr>
+        <w:br/>
+        <w:t>{0,0,1,0,0,0,1,1,0,0,0,0,0,1,0,0,0,0,0,0,0,0,0,0,0,1,0,0,0,0,0,0,0,0}, // Yunnan</w:t>
+      </w:r>
+      <w:r>
+        <w:rPr>
+          <w:noProof/>
+          <w:sz w:val="14"/>
+          <w:szCs w:val="14"/>
+        </w:rPr>
+        <w:br/>
+        <w:t>{1,0,0,1,0,0,0,0,0,0,0,0,0,0,1,1,0,0,0,0,0,0,0,0,0,0,0,0,0,0,0,0,0,0}, // Zhejiang</w:t>
+      </w:r>
+      <w:r>
+        <w:rPr>
+          <w:noProof/>
+          <w:sz w:val="14"/>
+          <w:szCs w:val="14"/>
+        </w:rPr>
+        <w:br/>
+        <w:t>{0,0,0,0,0,1,0,0,0,0,0,0,0,0,0,0,0,0,0,0,0,0,0,0,0,0,0,0,0,0,0,0,0,0}, // Hong Kong</w:t>
+      </w:r>
+      <w:r>
+        <w:rPr>
+          <w:noProof/>
+          <w:sz w:val="14"/>
+          <w:szCs w:val="14"/>
+        </w:rPr>
+        <w:br/>
+        <w:t>{0,0,0,0,0,1,0,0,0,0,0,0,0,0,0,0,0,0,0,0,0,0,0,0,0,0,0,0,0,0,0,0,0,0}, // Macau</w:t>
+      </w:r>
+      <w:r>
+        <w:rPr>
+          <w:noProof/>
+          <w:sz w:val="14"/>
+          <w:szCs w:val="14"/>
+        </w:rPr>
+        <w:br/>
+        <w:t>{0,0,0,0,0,0,0,0,0,0,0,0,0,0,0,0,0,0,0,0,0,0,0,0,0,0,0,0,0,0,0,0,0,0}, // Taiwan</w:t>
+      </w:r>
+      <w:r>
+        <w:rPr>
+          <w:noProof/>
+          <w:sz w:val="14"/>
+          <w:szCs w:val="14"/>
+        </w:rPr>
+        <w:br/>
+        <w:t>{0,1,0,0,0,0,0,0,0,1,0,0,0,0,0,0,0,0,0,0,0,0,0,0,0,0,0,0,0,0,0,0,0,0} // Tianjin</w:t>
+      </w:r>
+      <w:r>
+        <w:rPr>
+          <w:noProof/>
+          <w:sz w:val="14"/>
+          <w:szCs w:val="14"/>
+        </w:rPr>
+        <w:br/>
+      </w:r>
+      <w:r>
+        <w:rPr>
+          <w:noProof/>
+          <w:sz w:val="14"/>
+          <w:szCs w:val="14"/>
+        </w:rPr>
+        <w:br/>
+        <w:t>};</w:t>
+      </w:r>
+    </w:p>
+    <w:p>
+      <w:pPr>
+        <w:spacing w:after="0" w:line="240" w:lineRule="auto"/>
+        <w:rPr>
+          <w:noProof/>
+          <w:sz w:val="14"/>
+          <w:szCs w:val="14"/>
+        </w:rPr>
+      </w:pPr>
+    </w:p>
+    <w:p>
+      <w:pPr>
+        <w:spacing w:after="0" w:line="240" w:lineRule="auto"/>
+        <w:rPr>
+          <w:noProof/>
+          <w:sz w:val="14"/>
+          <w:szCs w:val="14"/>
+        </w:rPr>
+      </w:pPr>
+      <w:r>
+        <w:rPr>
+          <w:noProof/>
+          <w:sz w:val="14"/>
+          <w:szCs w:val="14"/>
+        </w:rPr>
+        <w:t>int iran[31][31] = {</w:t>
+      </w:r>
+    </w:p>
+    <w:p>
+      <w:pPr>
+        <w:spacing w:after="0" w:line="240" w:lineRule="auto"/>
+        <w:rPr>
+          <w:noProof/>
+          <w:sz w:val="14"/>
+          <w:szCs w:val="14"/>
+        </w:rPr>
+      </w:pPr>
+      <w:r>
+        <w:rPr>
+          <w:noProof/>
+          <w:sz w:val="14"/>
+          <w:szCs w:val="14"/>
+        </w:rPr>
+        <w:t>{0,0,0,0,0,0,0,0,0,0,0,0,0,0,0,0,0,0,0,0,0,0,0,0,1,0,0,0,1,0,1},</w:t>
+      </w:r>
+    </w:p>
+    <w:p>
+      <w:pPr>
+        <w:spacing w:after="0" w:line="240" w:lineRule="auto"/>
+        <w:rPr>
+          <w:noProof/>
+          <w:sz w:val="14"/>
+          <w:szCs w:val="14"/>
+        </w:rPr>
+      </w:pPr>
+      <w:r>
+        <w:rPr>
+          <w:noProof/>
+          <w:sz w:val="14"/>
+          <w:szCs w:val="14"/>
+        </w:rPr>
+        <w:t>{0,0,1,0,0,0,0,1,0,0,0,0,0,0,0,0,0,0,0,0,0,0,0,0,0,0,0,0,0,0,1},</w:t>
+      </w:r>
+    </w:p>
+    <w:p>
+      <w:pPr>
+        <w:spacing w:after="0" w:line="240" w:lineRule="auto"/>
+        <w:rPr>
+          <w:noProof/>
+          <w:sz w:val="14"/>
+          <w:szCs w:val="14"/>
+        </w:rPr>
+      </w:pPr>
+      <w:r>
+        <w:rPr>
+          <w:noProof/>
+          <w:sz w:val="14"/>
+          <w:szCs w:val="14"/>
+        </w:rPr>
+        <w:t>{0,1,0,1,0,0,0,0,0,0,0,0,0,0,0,0,0,0,0,0,0,0,0,0,0,0,0,0,0,0,1},</w:t>
+      </w:r>
+    </w:p>
+    <w:p>
+      <w:pPr>
+        <w:spacing w:after="0" w:line="240" w:lineRule="auto"/>
+        <w:rPr>
+          <w:noProof/>
+          <w:sz w:val="14"/>
+          <w:szCs w:val="14"/>
+        </w:rPr>
+      </w:pPr>
+      <w:r>
+        <w:rPr>
+          <w:noProof/>
+          <w:sz w:val="14"/>
+          <w:szCs w:val="14"/>
+        </w:rPr>
+        <w:t>{0,0,1,0,0,0,0,0,0,0,0,0,0,0,1,0,0,0,0,0,1,0,0,0,0,0,0,0,0,0,0},</w:t>
+      </w:r>
+    </w:p>
+    <w:p>
+      <w:pPr>
+        <w:spacing w:after="0" w:line="240" w:lineRule="auto"/>
+        <w:rPr>
+          <w:noProof/>
+          <w:sz w:val="14"/>
+          <w:szCs w:val="14"/>
+        </w:rPr>
+      </w:pPr>
+      <w:r>
+        <w:rPr>
+          <w:noProof/>
+          <w:sz w:val="14"/>
+          <w:szCs w:val="14"/>
+        </w:rPr>
+        <w:t>{0,0,0,0,0,0,1,0,0,0,1,0,0,0,0,0,0,0,1,0,0,0,0,0,0,0,0,0,0,0,0},</w:t>
+      </w:r>
+    </w:p>
+    <w:p>
+      <w:pPr>
+        <w:spacing w:after="0" w:line="240" w:lineRule="auto"/>
+        <w:rPr>
+          <w:noProof/>
+          <w:sz w:val="14"/>
+          <w:szCs w:val="14"/>
+        </w:rPr>
+      </w:pPr>
+      <w:r>
+        <w:rPr>
+          <w:noProof/>
+          <w:sz w:val="14"/>
+          <w:szCs w:val="14"/>
+        </w:rPr>
+        <w:t>{0,0,0,0,0,0,0,0,0,0,0,0,1,0,0,0,0,0,0,1,0,1,0,0,0,0,0,0,0,0,0},</w:t>
+      </w:r>
+    </w:p>
+    <w:p>
+      <w:pPr>
+        <w:spacing w:after="0" w:line="240" w:lineRule="auto"/>
+        <w:rPr>
+          <w:noProof/>
+          <w:sz w:val="14"/>
+          <w:szCs w:val="14"/>
+        </w:rPr>
+      </w:pPr>
+      <w:r>
+        <w:rPr>
+          <w:noProof/>
+          <w:sz w:val="14"/>
+          <w:szCs w:val="14"/>
+        </w:rPr>
+        <w:t>{0,0,0,0,1,0,0,0,0,0,1,0,1,0,0,0,0,0,0,1,0,0,0,0,0,0,0,0,0,0,0},</w:t>
+      </w:r>
+    </w:p>
+    <w:p>
+      <w:pPr>
+        <w:spacing w:after="0" w:line="240" w:lineRule="auto"/>
+        <w:rPr>
+          <w:noProof/>
+          <w:sz w:val="14"/>
+          <w:szCs w:val="14"/>
+        </w:rPr>
+      </w:pPr>
+      <w:r>
+        <w:rPr>
+          <w:noProof/>
+          <w:sz w:val="14"/>
+          <w:szCs w:val="14"/>
+        </w:rPr>
+        <w:t>{0,1,0,0,0,0,0,0,1,0,0,0,0,0,0,0,0,0,0,0,0,0,0,1,0,0,0,0,0,0,0},</w:t>
+      </w:r>
+    </w:p>
+    <w:p>
+      <w:pPr>
+        <w:spacing w:after="0" w:line="240" w:lineRule="auto"/>
+        <w:rPr>
+          <w:noProof/>
+          <w:sz w:val="14"/>
+          <w:szCs w:val="14"/>
+        </w:rPr>
+      </w:pPr>
+      <w:r>
+        <w:rPr>
+          <w:noProof/>
+          <w:sz w:val="14"/>
+          <w:szCs w:val="14"/>
+        </w:rPr>
+        <w:t>{0,0,0,0,0,0,0,1,0,0,0,0,0,0,0,1,1,0,0,0,0,0,0,1,0,0,1,0,0,0,0},</w:t>
+      </w:r>
+    </w:p>
+    <w:p>
+      <w:pPr>
+        <w:spacing w:after="0" w:line="240" w:lineRule="auto"/>
+        <w:rPr>
+          <w:noProof/>
+          <w:sz w:val="14"/>
+          <w:szCs w:val="14"/>
+        </w:rPr>
+      </w:pPr>
+      <w:r>
+        <w:rPr>
+          <w:noProof/>
+          <w:sz w:val="14"/>
+          <w:szCs w:val="14"/>
+        </w:rPr>
+        <w:t>{0,0,0,0,0,0,0,0,0,0,0,0,0,0,1,0,0,0,0,0,1,1,0,0,0,0,0,0,0,0,0},</w:t>
+      </w:r>
+    </w:p>
+    <w:p>
+      <w:pPr>
+        <w:spacing w:after="0" w:line="240" w:lineRule="auto"/>
+        <w:rPr>
+          <w:noProof/>
+          <w:sz w:val="14"/>
+          <w:szCs w:val="14"/>
+        </w:rPr>
+      </w:pPr>
+      <w:r>
+        <w:rPr>
+          <w:noProof/>
+          <w:sz w:val="14"/>
+          <w:szCs w:val="14"/>
+        </w:rPr>
+        <w:t>{0,0,0,0,1,0,1,0,0,0,0,0,0,1,0,0,0,0,0,0,0,0,0,0,0,0,0,0,0,0,0},</w:t>
+      </w:r>
+    </w:p>
+    <w:p>
+      <w:pPr>
+        <w:spacing w:after="0" w:line="240" w:lineRule="auto"/>
+        <w:rPr>
+          <w:noProof/>
+          <w:sz w:val="14"/>
+          <w:szCs w:val="14"/>
+        </w:rPr>
+      </w:pPr>
+      <w:r>
+        <w:rPr>
+          <w:noProof/>
+          <w:sz w:val="14"/>
+          <w:szCs w:val="14"/>
+        </w:rPr>
+        <w:t>{0,0,0,0,0,0,0,0,0,0,0,0,0,0,1,0,0,0,1,0,0,1,0,0,0,0,0,0,0,0,0},</w:t>
+      </w:r>
+    </w:p>
+    <w:p>
+      <w:pPr>
+        <w:spacing w:after="0" w:line="240" w:lineRule="auto"/>
+        <w:rPr>
+          <w:noProof/>
+          <w:sz w:val="14"/>
+          <w:szCs w:val="14"/>
+        </w:rPr>
+      </w:pPr>
+      <w:r>
+        <w:rPr>
+          <w:noProof/>
+          <w:sz w:val="14"/>
+          <w:szCs w:val="14"/>
+        </w:rPr>
+        <w:t>{0,0,0,0,0,1,1,0,0,0,0,0,0,0,0,0,0,0,0,0,0,0,1,0,0,1,1,0,0,1,0},</w:t>
+      </w:r>
+    </w:p>
+    <w:p>
+      <w:pPr>
+        <w:spacing w:after="0" w:line="240" w:lineRule="auto"/>
+        <w:rPr>
+          <w:noProof/>
+          <w:sz w:val="14"/>
+          <w:szCs w:val="14"/>
+        </w:rPr>
+      </w:pPr>
+      <w:r>
+        <w:rPr>
+          <w:noProof/>
+          <w:sz w:val="14"/>
+          <w:szCs w:val="14"/>
+        </w:rPr>
+        <w:t>{0,0,0,0,0,0,0,0,0,0,1,0,0,0,0,0,1,1,0,0,0,0,0,0,0,0,0,1,0,1,0},</w:t>
+      </w:r>
+    </w:p>
+    <w:p>
+      <w:pPr>
+        <w:spacing w:after="0" w:line="240" w:lineRule="auto"/>
+        <w:rPr>
+          <w:noProof/>
+          <w:sz w:val="14"/>
+          <w:szCs w:val="14"/>
+        </w:rPr>
+      </w:pPr>
+      <w:r>
+        <w:rPr>
+          <w:noProof/>
+          <w:sz w:val="14"/>
+          <w:szCs w:val="14"/>
+        </w:rPr>
+        <w:t>{0,0,0,1,0,0,0,0,0,1,0,1,0,0,0,0,0,0,0,0,1,1,0,0,0,0,0,0,0,0,0},</w:t>
+      </w:r>
+    </w:p>
+    <w:p>
+      <w:pPr>
+        <w:spacing w:after="0" w:line="240" w:lineRule="auto"/>
+        <w:rPr>
+          <w:noProof/>
+          <w:sz w:val="14"/>
+          <w:szCs w:val="14"/>
+        </w:rPr>
+      </w:pPr>
+      <w:r>
+        <w:rPr>
+          <w:noProof/>
+          <w:sz w:val="14"/>
+          <w:szCs w:val="14"/>
+        </w:rPr>
+        <w:t>{0,0,0,0,0,0,0,0,1,0,0,0,0,0,0,0,1,0,0,0,0,0,0,0,0,0,1,0,0,0,0},</w:t>
+      </w:r>
+    </w:p>
+    <w:p>
+      <w:pPr>
+        <w:spacing w:after="0" w:line="240" w:lineRule="auto"/>
+        <w:rPr>
+          <w:noProof/>
+          <w:sz w:val="14"/>
+          <w:szCs w:val="14"/>
+        </w:rPr>
+      </w:pPr>
+      <w:r>
+        <w:rPr>
+          <w:noProof/>
+          <w:sz w:val="14"/>
+          <w:szCs w:val="14"/>
+        </w:rPr>
+        <w:t>{0,0,0,0,0,0,0,0,1,0,0,0,0,1,0,1,0,1,0,0,0,0,0,0,0,0,1,0,0,0,0},</w:t>
+      </w:r>
+    </w:p>
+    <w:p>
+      <w:pPr>
+        <w:spacing w:after="0" w:line="240" w:lineRule="auto"/>
+        <w:rPr>
+          <w:noProof/>
+          <w:sz w:val="14"/>
+          <w:szCs w:val="14"/>
+        </w:rPr>
+      </w:pPr>
+      <w:r>
+        <w:rPr>
+          <w:noProof/>
+          <w:sz w:val="14"/>
+          <w:szCs w:val="14"/>
+        </w:rPr>
+        <w:t>{0,0,0,0,0,0,0,0,0,0,0,0,0,1,0,0,1,0,0,0,0,0,0,0,0,0,0,1,0,1,0},</w:t>
+      </w:r>
+    </w:p>
+    <w:p>
+      <w:pPr>
+        <w:spacing w:after="0" w:line="240" w:lineRule="auto"/>
+        <w:rPr>
+          <w:noProof/>
+          <w:sz w:val="14"/>
+          <w:szCs w:val="14"/>
+        </w:rPr>
+      </w:pPr>
+      <w:r>
+        <w:rPr>
+          <w:noProof/>
+          <w:sz w:val="14"/>
+          <w:szCs w:val="14"/>
+        </w:rPr>
+        <w:t>{0,0,0,0,1,0,0,0,0,0,0,1,0,0,0,0,0,0,0,0,0,1,0,0,0,0,0,0,0,0,0},</w:t>
+      </w:r>
+    </w:p>
+    <w:p>
+      <w:pPr>
+        <w:spacing w:after="0" w:line="240" w:lineRule="auto"/>
+        <w:rPr>
+          <w:noProof/>
+          <w:sz w:val="14"/>
+          <w:szCs w:val="14"/>
+        </w:rPr>
+      </w:pPr>
+      <w:r>
+        <w:rPr>
+          <w:noProof/>
+          <w:sz w:val="14"/>
+          <w:szCs w:val="14"/>
+        </w:rPr>
+        <w:t>{0,0,0,0,0,1,1,0,0,0,0,0,0,0,0,0,0,0,0,0,0,0,0,0,0,0,0,0,0,0,0},</w:t>
+      </w:r>
+    </w:p>
+    <w:p>
+      <w:pPr>
+        <w:spacing w:after="0" w:line="240" w:lineRule="auto"/>
+        <w:rPr>
+          <w:noProof/>
+          <w:sz w:val="14"/>
+          <w:szCs w:val="14"/>
+        </w:rPr>
+      </w:pPr>
+      <w:r>
+        <w:rPr>
+          <w:noProof/>
+          <w:sz w:val="14"/>
+          <w:szCs w:val="14"/>
+        </w:rPr>
+        <w:t>{0,0,0,1,0,0,0,0,0,1,0,0,0,0,1,0,0,0,0,0,0,0,0,0,0,0,0,0,0,0,1},</w:t>
+      </w:r>
+    </w:p>
+    <w:p>
+      <w:pPr>
+        <w:spacing w:after="0" w:line="240" w:lineRule="auto"/>
+        <w:rPr>
+          <w:noProof/>
+          <w:sz w:val="14"/>
+          <w:szCs w:val="14"/>
+        </w:rPr>
+      </w:pPr>
+      <w:r>
+        <w:rPr>
+          <w:noProof/>
+          <w:sz w:val="14"/>
+          <w:szCs w:val="14"/>
+        </w:rPr>
+        <w:t>{0,0,0,0,0,1,0,0,0,1,0,1,0,0,1,0,0,0,1,0,0,0,0,0,0,0,0,0,0,0,0},</w:t>
+      </w:r>
+    </w:p>
+    <w:p>
+      <w:pPr>
+        <w:spacing w:after="0" w:line="240" w:lineRule="auto"/>
+        <w:rPr>
+          <w:noProof/>
+          <w:sz w:val="14"/>
+          <w:szCs w:val="14"/>
+        </w:rPr>
+      </w:pPr>
+      <w:r>
+        <w:rPr>
+          <w:noProof/>
+          <w:sz w:val="14"/>
+          <w:szCs w:val="14"/>
+        </w:rPr>
+        <w:t>{0,0,0,0,0,0,0,0,0,0,0,0,1,0,0,0,0,0,0,0,0,0,0,0,1,1,0,0,1,0,1},</w:t>
+      </w:r>
+    </w:p>
+    <w:p>
+      <w:pPr>
+        <w:spacing w:after="0" w:line="240" w:lineRule="auto"/>
+        <w:rPr>
+          <w:noProof/>
+          <w:sz w:val="14"/>
+          <w:szCs w:val="14"/>
+        </w:rPr>
+      </w:pPr>
+      <w:r>
+        <w:rPr>
+          <w:noProof/>
+          <w:sz w:val="14"/>
+          <w:szCs w:val="14"/>
+        </w:rPr>
+        <w:t>{0,0,0,0,0,0,0,1,1,0,0,0,0,0,0,0,0,0,0,0,0,0,0,0,1,0,1,0,0,0,0},</w:t>
+      </w:r>
+    </w:p>
+    <w:p>
+      <w:pPr>
+        <w:spacing w:after="0" w:line="240" w:lineRule="auto"/>
+        <w:rPr>
+          <w:noProof/>
+          <w:sz w:val="14"/>
+          <w:szCs w:val="14"/>
+        </w:rPr>
+      </w:pPr>
+      <w:r>
+        <w:rPr>
+          <w:noProof/>
+          <w:sz w:val="14"/>
+          <w:szCs w:val="14"/>
+        </w:rPr>
+        <w:t>{1,0,0,0,0,0,0,0,0,0,0,0,0,0,0,0,0,0,0,0,0,0,1,1,0,0,0,0,1,0,1},</w:t>
+      </w:r>
+    </w:p>
+    <w:p>
+      <w:pPr>
+        <w:spacing w:after="0" w:line="240" w:lineRule="auto"/>
+        <w:rPr>
+          <w:noProof/>
+          <w:sz w:val="14"/>
+          <w:szCs w:val="14"/>
+        </w:rPr>
+      </w:pPr>
+      <w:r>
+        <w:rPr>
+          <w:noProof/>
+          <w:sz w:val="14"/>
+          <w:szCs w:val="14"/>
+        </w:rPr>
+        <w:t>{0,0,0,0,0,0,0,0,0,0,0,0,1,0,0,0,0,0,0,0,0,0,1,0,0,0,1,0,1,0,0},</w:t>
+      </w:r>
+    </w:p>
+    <w:p>
+      <w:pPr>
+        <w:spacing w:after="0" w:line="240" w:lineRule="auto"/>
+        <w:rPr>
+          <w:noProof/>
+          <w:sz w:val="14"/>
+          <w:szCs w:val="14"/>
+        </w:rPr>
+      </w:pPr>
+      <w:r>
+        <w:rPr>
+          <w:noProof/>
+          <w:sz w:val="14"/>
+          <w:szCs w:val="14"/>
+        </w:rPr>
+        <w:t>{0,0,0,0,0,0,0,0,1,0,0,0,1,0,0,1,1,0,0,0,0,0,0,1,0,1,0,0,0,1,0},</w:t>
+      </w:r>
+    </w:p>
+    <w:p>
+      <w:pPr>
+        <w:spacing w:after="0" w:line="240" w:lineRule="auto"/>
+        <w:rPr>
+          <w:noProof/>
+          <w:sz w:val="14"/>
+          <w:szCs w:val="14"/>
+        </w:rPr>
+      </w:pPr>
+      <w:r>
+        <w:rPr>
+          <w:noProof/>
+          <w:sz w:val="14"/>
+          <w:szCs w:val="14"/>
+        </w:rPr>
+        <w:t>{0,0,0,0,0,0,0,0,0,0,0,0,0,1,0,0,0,1,0,0,0,0,0,0,0,0,0,0,0,1,0},</w:t>
+      </w:r>
+    </w:p>
+    <w:p>
+      <w:pPr>
+        <w:spacing w:after="0" w:line="240" w:lineRule="auto"/>
+        <w:rPr>
+          <w:noProof/>
+          <w:sz w:val="14"/>
+          <w:szCs w:val="14"/>
+        </w:rPr>
+      </w:pPr>
+      <w:r>
+        <w:rPr>
+          <w:noProof/>
+          <w:sz w:val="14"/>
+          <w:szCs w:val="14"/>
+        </w:rPr>
+        <w:lastRenderedPageBreak/>
+        <w:t>{1,0,0,0,0,0,0,0,0,0,0,0,0,0,0,0,0,0,0,0,0,0,1,0,1,1,0,0,0,0,0},</w:t>
+      </w:r>
+    </w:p>
+    <w:p>
+      <w:pPr>
+        <w:spacing w:after="0" w:line="240" w:lineRule="auto"/>
+        <w:rPr>
+          <w:noProof/>
+          <w:sz w:val="14"/>
+          <w:szCs w:val="14"/>
+        </w:rPr>
+      </w:pPr>
+      <w:r>
+        <w:rPr>
+          <w:noProof/>
+          <w:sz w:val="14"/>
+          <w:szCs w:val="14"/>
+        </w:rPr>
+        <w:t>{0,0,0,0,0,0,0,0,0,0,0,0,1,1,0,0,0,1,0,0,0,0,0,0,0,0,1,1,0,0,0},</w:t>
+      </w:r>
+    </w:p>
+    <w:p>
+      <w:pPr>
+        <w:spacing w:after="0" w:line="240" w:lineRule="auto"/>
+        <w:rPr>
+          <w:noProof/>
+          <w:sz w:val="14"/>
+          <w:szCs w:val="14"/>
+        </w:rPr>
+      </w:pPr>
+      <w:r>
+        <w:rPr>
+          <w:noProof/>
+          <w:sz w:val="14"/>
+          <w:szCs w:val="14"/>
+        </w:rPr>
+        <w:t>{1,1,1,0,0,0,0,0,0,0,0,0,0,0,0,0,0,0,0,0,1,0,1,0,1,0,0,0,0,0,0}</w:t>
+      </w:r>
+    </w:p>
+    <w:p>
+      <w:pPr>
+        <w:spacing w:after="0" w:line="240" w:lineRule="auto"/>
+        <w:rPr>
+          <w:noProof/>
+          <w:sz w:val="14"/>
+          <w:szCs w:val="14"/>
+        </w:rPr>
+      </w:pPr>
+      <w:r>
+        <w:rPr>
+          <w:noProof/>
+          <w:sz w:val="14"/>
+          <w:szCs w:val="14"/>
+        </w:rPr>
+        <w:t>};</w:t>
+      </w:r>
     </w:p>
     <w:sectPr>
       <w:pgSz w:w="12240" w:h="15840"/>
@@ -3307,6 +5550,119 @@
     </w:lvl>
   </w:abstractNum>
   <w:abstractNum w:abstractNumId="2" w15:restartNumberingAfterBreak="0">
+    <w:nsid w:val="2DB1210C"/>
+    <w:multiLevelType w:val="hybridMultilevel"/>
+    <w:tmpl w:val="A30CABE2"/>
+    <w:lvl w:ilvl="0" w:tplc="AFA0FFB6">
+      <w:start w:val="4"/>
+      <w:numFmt w:val="bullet"/>
+      <w:lvlText w:val="-"/>
+      <w:lvlJc w:val="left"/>
+      <w:pPr>
+        <w:ind w:left="720" w:hanging="360"/>
+      </w:pPr>
+      <w:rPr>
+        <w:rFonts w:ascii="Aptos" w:eastAsiaTheme="minorHAnsi" w:hAnsi="Aptos" w:cstheme="minorBidi" w:hint="default"/>
+      </w:rPr>
+    </w:lvl>
+    <w:lvl w:ilvl="1" w:tplc="10090003">
+      <w:start w:val="1"/>
+      <w:numFmt w:val="bullet"/>
+      <w:lvlText w:val="o"/>
+      <w:lvlJc w:val="left"/>
+      <w:pPr>
+        <w:ind w:left="1440" w:hanging="360"/>
+      </w:pPr>
+      <w:rPr>
+        <w:rFonts w:ascii="Courier New" w:hAnsi="Courier New" w:cs="Courier New" w:hint="default"/>
+      </w:rPr>
+    </w:lvl>
+    <w:lvl w:ilvl="2" w:tplc="10090005">
+      <w:start w:val="1"/>
+      <w:numFmt w:val="bullet"/>
+      <w:lvlText w:val=""/>
+      <w:lvlJc w:val="left"/>
+      <w:pPr>
+        <w:ind w:left="2160" w:hanging="360"/>
+      </w:pPr>
+      <w:rPr>
+        <w:rFonts w:ascii="Wingdings" w:hAnsi="Wingdings" w:hint="default"/>
+      </w:rPr>
+    </w:lvl>
+    <w:lvl w:ilvl="3" w:tplc="10090001">
+      <w:start w:val="1"/>
+      <w:numFmt w:val="bullet"/>
+      <w:lvlText w:val=""/>
+      <w:lvlJc w:val="left"/>
+      <w:pPr>
+        <w:ind w:left="2880" w:hanging="360"/>
+      </w:pPr>
+      <w:rPr>
+        <w:rFonts w:ascii="Symbol" w:hAnsi="Symbol" w:hint="default"/>
+      </w:rPr>
+    </w:lvl>
+    <w:lvl w:ilvl="4" w:tplc="10090003" w:tentative="1">
+      <w:start w:val="1"/>
+      <w:numFmt w:val="bullet"/>
+      <w:lvlText w:val="o"/>
+      <w:lvlJc w:val="left"/>
+      <w:pPr>
+        <w:ind w:left="3600" w:hanging="360"/>
+      </w:pPr>
+      <w:rPr>
+        <w:rFonts w:ascii="Courier New" w:hAnsi="Courier New" w:cs="Courier New" w:hint="default"/>
+      </w:rPr>
+    </w:lvl>
+    <w:lvl w:ilvl="5" w:tplc="10090005" w:tentative="1">
+      <w:start w:val="1"/>
+      <w:numFmt w:val="bullet"/>
+      <w:lvlText w:val=""/>
+      <w:lvlJc w:val="left"/>
+      <w:pPr>
+        <w:ind w:left="4320" w:hanging="360"/>
+      </w:pPr>
+      <w:rPr>
+        <w:rFonts w:ascii="Wingdings" w:hAnsi="Wingdings" w:hint="default"/>
+      </w:rPr>
+    </w:lvl>
+    <w:lvl w:ilvl="6" w:tplc="10090001" w:tentative="1">
+      <w:start w:val="1"/>
+      <w:numFmt w:val="bullet"/>
+      <w:lvlText w:val=""/>
+      <w:lvlJc w:val="left"/>
+      <w:pPr>
+        <w:ind w:left="5040" w:hanging="360"/>
+      </w:pPr>
+      <w:rPr>
+        <w:rFonts w:ascii="Symbol" w:hAnsi="Symbol" w:hint="default"/>
+      </w:rPr>
+    </w:lvl>
+    <w:lvl w:ilvl="7" w:tplc="10090003" w:tentative="1">
+      <w:start w:val="1"/>
+      <w:numFmt w:val="bullet"/>
+      <w:lvlText w:val="o"/>
+      <w:lvlJc w:val="left"/>
+      <w:pPr>
+        <w:ind w:left="5760" w:hanging="360"/>
+      </w:pPr>
+      <w:rPr>
+        <w:rFonts w:ascii="Courier New" w:hAnsi="Courier New" w:cs="Courier New" w:hint="default"/>
+      </w:rPr>
+    </w:lvl>
+    <w:lvl w:ilvl="8" w:tplc="10090005" w:tentative="1">
+      <w:start w:val="1"/>
+      <w:numFmt w:val="bullet"/>
+      <w:lvlText w:val=""/>
+      <w:lvlJc w:val="left"/>
+      <w:pPr>
+        <w:ind w:left="6480" w:hanging="360"/>
+      </w:pPr>
+      <w:rPr>
+        <w:rFonts w:ascii="Wingdings" w:hAnsi="Wingdings" w:hint="default"/>
+      </w:rPr>
+    </w:lvl>
+  </w:abstractNum>
+  <w:abstractNum w:abstractNumId="3" w15:restartNumberingAfterBreak="0">
     <w:nsid w:val="486D4123"/>
     <w:multiLevelType w:val="hybridMultilevel"/>
     <w:tmpl w:val="D9B0E52A"/>
@@ -3419,7 +5775,7 @@
       </w:rPr>
     </w:lvl>
   </w:abstractNum>
-  <w:abstractNum w:abstractNumId="3" w15:restartNumberingAfterBreak="0">
+  <w:abstractNum w:abstractNumId="4" w15:restartNumberingAfterBreak="0">
     <w:nsid w:val="5A1071E5"/>
     <w:multiLevelType w:val="hybridMultilevel"/>
     <w:tmpl w:val="407669BE"/>
@@ -3508,7 +5864,7 @@
       </w:pPr>
     </w:lvl>
   </w:abstractNum>
-  <w:abstractNum w:abstractNumId="4" w15:restartNumberingAfterBreak="0">
+  <w:abstractNum w:abstractNumId="5" w15:restartNumberingAfterBreak="0">
     <w:nsid w:val="7CEF3CA1"/>
     <w:multiLevelType w:val="hybridMultilevel"/>
     <w:tmpl w:val="24DC8CE8"/>
@@ -3621,19 +5977,22 @@
     </w:lvl>
   </w:abstractNum>
   <w:num w:numId="1" w16cid:durableId="333991424">
-    <w:abstractNumId w:val="4"/>
+    <w:abstractNumId w:val="5"/>
   </w:num>
   <w:num w:numId="2" w16cid:durableId="491289422">
     <w:abstractNumId w:val="1"/>
   </w:num>
   <w:num w:numId="3" w16cid:durableId="1751198521">
-    <w:abstractNumId w:val="2"/>
+    <w:abstractNumId w:val="3"/>
   </w:num>
   <w:num w:numId="4" w16cid:durableId="26302265">
     <w:abstractNumId w:val="0"/>
   </w:num>
   <w:num w:numId="5" w16cid:durableId="1673606921">
-    <w:abstractNumId w:val="3"/>
+    <w:abstractNumId w:val="4"/>
+  </w:num>
+  <w:num w:numId="6" w16cid:durableId="1632664613">
+    <w:abstractNumId w:val="2"/>
   </w:num>
 </w:numbering>
 </file>

</xml_diff>

<commit_message>
ädded counterexample (new) and animated everthing. Updated graph visualizer
</commit_message>
<xml_diff>
--- a/5 Colour Theorem Kempe.docx
+++ b/5 Colour Theorem Kempe.docx
@@ -127,6 +127,26 @@
           <w:rFonts w:ascii="Bookman Old Style" w:hAnsi="Bookman Old Style"/>
           <w:lang w:val="en-GB"/>
         </w:rPr>
+        <w:t>Email correction.</w:t>
+      </w:r>
+    </w:p>
+    <w:p>
+      <w:pPr>
+        <w:pStyle w:val="ListParagraph"/>
+        <w:numPr>
+          <w:ilvl w:val="0"/>
+          <w:numId w:val="6"/>
+        </w:numPr>
+        <w:rPr>
+          <w:rFonts w:ascii="Bookman Old Style" w:hAnsi="Bookman Old Style"/>
+          <w:lang w:val="en-GB"/>
+        </w:rPr>
+      </w:pPr>
+      <w:r>
+        <w:rPr>
+          <w:rFonts w:ascii="Bookman Old Style" w:hAnsi="Bookman Old Style"/>
+          <w:lang w:val="en-GB"/>
+        </w:rPr>
         <w:t>Overview, proof, and method.</w:t>
       </w:r>
     </w:p>
@@ -204,6 +224,13 @@
           <w:lang w:val="en-GB"/>
         </w:rPr>
         <w:t>6) with Kempe-based method</w:t>
+      </w:r>
+      <w:r>
+        <w:rPr>
+          <w:rFonts w:ascii="Bookman Old Style" w:hAnsi="Bookman Old Style"/>
+          <w:lang w:val="en-GB"/>
+        </w:rPr>
+        <w:t xml:space="preserve"> (probably not possible?).</w:t>
       </w:r>
     </w:p>
     <w:p>
@@ -450,16 +477,15 @@
           <w:rFonts w:ascii="Bookman Old Style" w:hAnsi="Bookman Old Style"/>
           <w:lang w:val="en-GB"/>
         </w:rPr>
-        <w:t>Apex graph.</w:t>
-      </w:r>
-    </w:p>
-    <w:p>
-      <w:pPr>
+        <w:t>Apex graph</w:t>
+      </w:r>
+      <w:r>
         <w:rPr>
           <w:rFonts w:ascii="Bookman Old Style" w:hAnsi="Bookman Old Style"/>
           <w:lang w:val="en-GB"/>
         </w:rPr>
-      </w:pPr>
+        <w:t>: a graph where a vertex deletion makes the graph planar.</w:t>
+      </w:r>
     </w:p>
     <w:p>
       <w:pPr>
@@ -496,25 +522,32 @@
     <w:p>
       <w:pPr>
         <w:rPr>
-          <w:lang w:val="en-GB"/>
-        </w:rPr>
-      </w:pPr>
-    </w:p>
-    <w:p>
-      <w:pPr>
-        <w:rPr>
-          <w:sz w:val="28"/>
-          <w:szCs w:val="28"/>
-          <w:lang w:val="en-GB"/>
-        </w:rPr>
-      </w:pPr>
-      <w:r>
-        <w:rPr>
-          <w:sz w:val="28"/>
-          <w:szCs w:val="28"/>
-          <w:lang w:val="en-GB"/>
-        </w:rPr>
-        <w:lastRenderedPageBreak/>
+          <w:rFonts w:ascii="Bookman Old Style" w:hAnsi="Bookman Old Style"/>
+          <w:lang w:val="en-GB"/>
+        </w:rPr>
+      </w:pPr>
+    </w:p>
+    <w:p>
+      <w:pPr>
+        <w:rPr>
+          <w:lang w:val="en-GB"/>
+        </w:rPr>
+      </w:pPr>
+    </w:p>
+    <w:p>
+      <w:pPr>
+        <w:rPr>
+          <w:sz w:val="28"/>
+          <w:szCs w:val="28"/>
+          <w:lang w:val="en-GB"/>
+        </w:rPr>
+      </w:pPr>
+      <w:r>
+        <w:rPr>
+          <w:sz w:val="28"/>
+          <w:szCs w:val="28"/>
+          <w:lang w:val="en-GB"/>
+        </w:rPr>
         <w:t xml:space="preserve">A </w:t>
       </w:r>
       <w:r>
@@ -1177,7 +1210,7 @@
           </mc:Choice>
           <mc:Fallback>
             <w:pict>
-              <v:shapetype w14:anchorId="737852B5" id="_x0000_t75" coordsize="21600,21600" o:spt="75" o:preferrelative="t" path="m@4@5l@4@11@9@11@9@5xe" filled="f" stroked="f">
+              <v:shapetype w14:anchorId="09963A0D" id="_x0000_t75" coordsize="21600,21600" o:spt="75" o:preferrelative="t" path="m@4@5l@4@11@9@11@9@5xe" filled="f" stroked="f">
                 <v:stroke joinstyle="miter"/>
                 <v:formulas>
                   <v:f eqn="if lineDrawn pixelLineWidth 0"/>
@@ -1196,7 +1229,7 @@
                 <v:path o:extrusionok="f" gradientshapeok="t" o:connecttype="rect"/>
                 <o:lock v:ext="edit" aspectratio="t"/>
               </v:shapetype>
-              <v:shape id="Ink 7" o:spid="_x0000_s1026" type="#_x0000_t75" style="position:absolute;margin-left:162.7pt;margin-top:124.15pt;width:164.85pt;height:142.05pt;z-index:251665408;visibility:visible;mso-wrap-style:square;mso-wrap-distance-left:9pt;mso-wrap-distance-top:0;mso-wrap-distance-right:9pt;mso-wrap-distance-bottom:0;mso-position-horizontal:absolute;mso-position-horizontal-relative:text;mso-position-vertical:absolute;mso-position-vertical-relative:text" o:gfxdata="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">
+              <v:shape id="Ink 7" o:spid="_x0000_s1026" type="#_x0000_t75" style="position:absolute;margin-left:162.7pt;margin-top:124.15pt;width:164.85pt;height:142.05pt;z-index:251665408;visibility:visible;mso-wrap-style:square;mso-wrap-distance-left:9pt;mso-wrap-distance-top:0;mso-wrap-distance-right:9pt;mso-wrap-distance-bottom:0;mso-position-horizontal:absolute;mso-position-horizontal-relative:text;mso-position-vertical:absolute;mso-position-vertical-relative:text" o:gfxdata="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">
                 <v:imagedata r:id="rId7" o:title=""/>
               </v:shape>
             </w:pict>
@@ -1653,6 +1686,27 @@
           <w:lang w:val="en-GB"/>
         </w:rPr>
         <w:t>ases:</w:t>
+      </w:r>
+    </w:p>
+    <w:p>
+      <w:pPr>
+        <w:rPr>
+          <w:b/>
+          <w:bCs/>
+          <w:sz w:val="28"/>
+          <w:szCs w:val="28"/>
+          <w:lang w:val="en-GB"/>
+        </w:rPr>
+      </w:pPr>
+      <w:r>
+        <w:rPr>
+          <w:b/>
+          <w:bCs/>
+          <w:sz w:val="28"/>
+          <w:szCs w:val="28"/>
+          <w:lang w:val="en-GB"/>
+        </w:rPr>
+        <w:t xml:space="preserve">DO ANIMATION FOR EACH NODE </w:t>
       </w:r>
     </w:p>
     <w:p>
@@ -3523,6 +3577,24 @@
           <w:szCs w:val="14"/>
         </w:rPr>
       </w:pPr>
+      <w:r>
+        <w:rPr>
+          <w:noProof/>
+          <w:sz w:val="14"/>
+          <w:szCs w:val="14"/>
+        </w:rPr>
+        <w:t>Error in node 2 and 22.</w:t>
+      </w:r>
+    </w:p>
+    <w:p>
+      <w:pPr>
+        <w:spacing w:after="0" w:line="240" w:lineRule="auto"/>
+        <w:rPr>
+          <w:noProof/>
+          <w:sz w:val="14"/>
+          <w:szCs w:val="14"/>
+        </w:rPr>
+      </w:pPr>
     </w:p>
     <w:p>
       <w:pPr>
@@ -4307,6 +4379,14 @@
           <w:szCs w:val="14"/>
         </w:rPr>
         <w:br/>
+      </w:r>
+      <w:r>
+        <w:rPr>
+          <w:noProof/>
+          <w:sz w:val="14"/>
+          <w:szCs w:val="14"/>
+        </w:rPr>
+        <w:lastRenderedPageBreak/>
         <w:t>{0,0,0,0,0,0,0,0,0,1,0,0,1,0,0,0,0,0,1,0,1,0,0,0}, // Cherkasy</w:t>
       </w:r>
       <w:r>
@@ -4316,14 +4396,6 @@
           <w:szCs w:val="14"/>
         </w:rPr>
         <w:br/>
-      </w:r>
-      <w:r>
-        <w:rPr>
-          <w:noProof/>
-          <w:sz w:val="14"/>
-          <w:szCs w:val="14"/>
-        </w:rPr>
-        <w:lastRenderedPageBreak/>
         <w:t>{0,0,0,0,0,1,1,1,1,0,0,0,0,0,0,0,0,0,1,1,0,1,0,0}, // Vinnytsia</w:t>
       </w:r>
       <w:r>
@@ -5259,6 +5331,7 @@
           <w:sz w:val="14"/>
           <w:szCs w:val="14"/>
         </w:rPr>
+        <w:lastRenderedPageBreak/>
         <w:t>{0,0,0,0,0,0,0,0,0,0,0,0,0,1,0,0,0,1,0,0,0,0,0,0,0,0,0,0,0,1,0},</w:t>
       </w:r>
     </w:p>
@@ -5277,7 +5350,6 @@
           <w:sz w:val="14"/>
           <w:szCs w:val="14"/>
         </w:rPr>
-        <w:lastRenderedPageBreak/>
         <w:t>{1,0,0,0,0,0,0,0,0,0,0,0,0,0,0,0,0,0,0,0,0,0,1,0,1,1,0,0,0,0,0},</w:t>
       </w:r>
     </w:p>

</xml_diff>